<commit_message>
Update sem5, RKT KD
</commit_message>
<xml_diff>
--- a/sem7/РКТ/РПЗ Курсач.docx
+++ b/sem7/РКТ/РПЗ Курсач.docx
@@ -1522,7 +1522,7 @@
               </wp:anchor>
             </w:drawing>
           </mc:Choice>
-          <mc:Fallback xmlns:oel="http://schemas.microsoft.com/office/2019/extlst" xmlns:w16du="http://schemas.microsoft.com/office/word/2023/wordml/word16du" xmlns:w16sdtfl="http://schemas.microsoft.com/office/word/2024/wordml/sdtformatlock">
+          <mc:Fallback xmlns:w16sdtfl="http://schemas.microsoft.com/office/word/2024/wordml/sdtformatlock" xmlns:w16du="http://schemas.microsoft.com/office/word/2023/wordml/word16du" xmlns:oel="http://schemas.microsoft.com/office/2019/extlst">
             <w:pict>
               <v:line w14:anchorId="2C29C87F" id="Прямая соединительная линия 1" o:spid="_x0000_s1026" style="position:absolute;z-index:251660288;visibility:visible;mso-wrap-style:square;mso-wrap-distance-left:9pt;mso-wrap-distance-top:0;mso-wrap-distance-right:9pt;mso-wrap-distance-bottom:0;mso-position-horizontal:absolute;mso-position-horizontal-relative:text;mso-position-vertical:absolute;mso-position-vertical-relative:text" from="346.45pt,11.7pt" to="486.15pt,11.7pt" o:gfxdata="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" strokecolor="black [3213]" strokeweight=".5pt"/>
             </w:pict>
@@ -12012,16 +12012,7 @@
           <w:szCs w:val="24"/>
           <w:lang w:eastAsia="zh-CN"/>
         </w:rPr>
-        <w:t>89762,9</w:t>
-      </w:r>
-      <w:r>
-        <w:rPr>
-          <w:rFonts w:ascii="Times New Roman" w:hAnsi="Times New Roman"/>
-          <w:sz w:val="24"/>
-          <w:szCs w:val="24"/>
-          <w:lang w:eastAsia="zh-CN"/>
-        </w:rPr>
-        <w:t xml:space="preserve"> </w:t>
+        <w:t xml:space="preserve">89762,9 </w:t>
       </w:r>
       <w:r>
         <w:rPr>
@@ -12057,16 +12048,7 @@
           <w:szCs w:val="24"/>
           <w:lang w:eastAsia="zh-CN"/>
         </w:rPr>
-        <w:t>5141,6</w:t>
-      </w:r>
-      <w:r>
-        <w:rPr>
-          <w:rFonts w:ascii="Times New Roman" w:hAnsi="Times New Roman"/>
-          <w:sz w:val="24"/>
-          <w:szCs w:val="24"/>
-          <w:lang w:eastAsia="zh-CN"/>
-        </w:rPr>
-        <w:t xml:space="preserve"> </w:t>
+        <w:t xml:space="preserve">5141,6 </w:t>
       </w:r>
       <w:r>
         <w:rPr>
@@ -12238,16 +12220,7 @@
           <w:szCs w:val="24"/>
           <w:lang w:eastAsia="zh-CN"/>
         </w:rPr>
-        <w:t>1700,4</w:t>
-      </w:r>
-      <w:r>
-        <w:rPr>
-          <w:rFonts w:ascii="Times New Roman" w:hAnsi="Times New Roman"/>
-          <w:sz w:val="24"/>
-          <w:szCs w:val="24"/>
-          <w:lang w:eastAsia="zh-CN"/>
-        </w:rPr>
-        <w:t xml:space="preserve"> </w:t>
+        <w:t xml:space="preserve">1700,4 </w:t>
       </w:r>
       <w:r>
         <w:rPr>
@@ -12317,16 +12290,7 @@
           <w:szCs w:val="24"/>
           <w:lang w:eastAsia="zh-CN"/>
         </w:rPr>
-        <w:t>1892,1</w:t>
-      </w:r>
-      <w:r>
-        <w:rPr>
-          <w:rFonts w:ascii="Times New Roman" w:hAnsi="Times New Roman"/>
-          <w:sz w:val="24"/>
-          <w:szCs w:val="24"/>
-          <w:lang w:eastAsia="zh-CN"/>
-        </w:rPr>
-        <w:t xml:space="preserve"> </w:t>
+        <w:t xml:space="preserve">1892,1 </w:t>
       </w:r>
       <w:r>
         <w:rPr>
@@ -12380,16 +12344,7 @@
           <w:szCs w:val="24"/>
           <w:lang w:eastAsia="zh-CN"/>
         </w:rPr>
-        <w:t>660,2</w:t>
-      </w:r>
-      <w:r>
-        <w:rPr>
-          <w:rFonts w:ascii="Times New Roman" w:hAnsi="Times New Roman"/>
-          <w:sz w:val="24"/>
-          <w:szCs w:val="24"/>
-          <w:lang w:eastAsia="zh-CN"/>
-        </w:rPr>
-        <w:t xml:space="preserve"> </w:t>
+        <w:t xml:space="preserve">660,2 </w:t>
       </w:r>
       <w:r>
         <w:rPr>
@@ -12572,16 +12527,7 @@
           <w:szCs w:val="24"/>
           <w:lang w:eastAsia="zh-CN"/>
         </w:rPr>
-        <w:t>7107,4</w:t>
-      </w:r>
-      <w:r>
-        <w:rPr>
-          <w:rFonts w:ascii="Times New Roman" w:hAnsi="Times New Roman"/>
-          <w:sz w:val="24"/>
-          <w:szCs w:val="24"/>
-          <w:lang w:eastAsia="zh-CN"/>
-        </w:rPr>
-        <w:t xml:space="preserve"> </w:t>
+        <w:t xml:space="preserve">7107,4 </w:t>
       </w:r>
       <w:r>
         <w:rPr>
@@ -12751,16 +12697,7 @@
           <w:szCs w:val="24"/>
           <w:lang w:eastAsia="zh-CN"/>
         </w:rPr>
-        <w:t>422,1</w:t>
-      </w:r>
-      <w:r>
-        <w:rPr>
-          <w:rFonts w:ascii="Times New Roman" w:hAnsi="Times New Roman"/>
-          <w:sz w:val="24"/>
-          <w:szCs w:val="24"/>
-          <w:lang w:eastAsia="zh-CN"/>
-        </w:rPr>
-        <w:t xml:space="preserve"> </w:t>
+        <w:t xml:space="preserve">422,1 </w:t>
       </w:r>
       <w:r>
         <w:rPr>
@@ -14114,7 +14051,7 @@
       </m:oMath>
       <w:r>
         <w:rPr>
-          <w:rFonts w:ascii="Calibri" w:hAnsi="Cambria Math" w:cs="Times New Roman"/>
+          <w:rFonts w:ascii="Times New Roman" w:hAnsi="Times New Roman" w:cs="Times New Roman"/>
           <w:sz w:val="24"/>
           <w:szCs w:val="24"/>
         </w:rPr>
@@ -14122,7 +14059,7 @@
       </w:r>
       <w:r>
         <w:rPr>
-          <w:rFonts w:ascii="Times New Roman" w:hAnsi="Times New Roman"/>
+          <w:rFonts w:ascii="Times New Roman" w:hAnsi="Times New Roman" w:cs="Times New Roman"/>
           <w:sz w:val="24"/>
           <w:szCs w:val="24"/>
           <w:lang w:eastAsia="zh-CN"/>
@@ -14131,7 +14068,7 @@
       </w:r>
       <w:r>
         <w:rPr>
-          <w:rFonts w:ascii="Calibri" w:hAnsi="Cambria Math" w:cs="Times New Roman"/>
+          <w:rFonts w:ascii="Times New Roman" w:hAnsi="Times New Roman" w:cs="Times New Roman"/>
           <w:sz w:val="24"/>
           <w:szCs w:val="24"/>
         </w:rPr>
@@ -14207,7 +14144,7 @@
       </m:oMath>
       <w:r>
         <w:rPr>
-          <w:rFonts w:ascii="Calibri" w:hAnsi="Cambria Math" w:cs="Times New Roman"/>
+          <w:rFonts w:ascii="Times New Roman" w:hAnsi="Times New Roman" w:cs="Times New Roman"/>
           <w:sz w:val="24"/>
           <w:szCs w:val="24"/>
         </w:rPr>
@@ -14215,7 +14152,15 @@
       </w:r>
       <w:r>
         <w:rPr>
-          <w:rFonts w:ascii="Calibri" w:hAnsi="Cambria Math" w:cs="Times New Roman"/>
+          <w:rFonts w:ascii="Times New Roman" w:hAnsi="Times New Roman" w:cs="Times New Roman"/>
+          <w:sz w:val="24"/>
+          <w:szCs w:val="24"/>
+        </w:rPr>
+        <w:t xml:space="preserve">32135,1 </w:t>
+      </w:r>
+      <w:r>
+        <w:rPr>
+          <w:rFonts w:ascii="Times New Roman" w:hAnsi="Times New Roman" w:cs="Times New Roman"/>
           <w:sz w:val="24"/>
           <w:szCs w:val="24"/>
         </w:rPr>
@@ -14275,7 +14220,7 @@
       </m:oMath>
       <w:r>
         <w:rPr>
-          <w:rFonts w:ascii="Calibri" w:hAnsi="Cambria Math" w:cs="Times New Roman"/>
+          <w:rFonts w:ascii="Times New Roman" w:hAnsi="Times New Roman" w:cs="Times New Roman"/>
           <w:sz w:val="24"/>
           <w:szCs w:val="24"/>
         </w:rPr>
@@ -14317,7 +14262,7 @@
       </m:oMath>
       <w:r>
         <w:rPr>
-          <w:rFonts w:ascii="Calibri" w:hAnsi="Cambria Math" w:cs="Times New Roman"/>
+          <w:rFonts w:ascii="Times New Roman" w:hAnsi="Times New Roman" w:cs="Times New Roman"/>
           <w:sz w:val="24"/>
           <w:szCs w:val="24"/>
         </w:rPr>
@@ -14359,38 +14304,36 @@
       </m:oMath>
       <w:r>
         <w:rPr>
-          <w:rFonts w:ascii="Calibri" w:hAnsi="Cambria Math" w:cs="Times New Roman"/>
+          <w:rFonts w:ascii="Times New Roman" w:hAnsi="Times New Roman" w:cs="Times New Roman"/>
+          <w:sz w:val="24"/>
+          <w:szCs w:val="24"/>
+        </w:rPr>
+        <w:t xml:space="preserve"> = </w:t>
+      </w:r>
+      <w:r>
+        <w:rPr>
+          <w:rFonts w:ascii="Times New Roman" w:hAnsi="Times New Roman" w:cs="Times New Roman"/>
+          <w:sz w:val="24"/>
+          <w:szCs w:val="24"/>
+        </w:rPr>
+        <w:t>57627,8</w:t>
+      </w:r>
+      <w:r>
+        <w:rPr>
+          <w:rFonts w:ascii="Times New Roman" w:hAnsi="Times New Roman" w:cs="Times New Roman"/>
           <w:sz w:val="24"/>
           <w:szCs w:val="24"/>
         </w:rPr>
         <w:t xml:space="preserve"> </w:t>
       </w:r>
-      <w:proofErr w:type="gramStart"/>
-      <w:r>
-        <w:rPr>
-          <w:rFonts w:ascii="Calibri" w:hAnsi="Cambria Math" w:cs="Times New Roman"/>
-          <w:sz w:val="24"/>
-          <w:szCs w:val="24"/>
-        </w:rPr>
-        <w:t xml:space="preserve">= </w:t>
-      </w:r>
-      <w:r>
-        <w:rPr>
-          <w:rFonts w:ascii="Calibri" w:hAnsi="Cambria Math" w:cs="Times New Roman"/>
-          <w:sz w:val="24"/>
-          <w:szCs w:val="24"/>
-        </w:rPr>
-        <w:t xml:space="preserve"> </w:t>
-      </w:r>
-      <w:r>
-        <w:rPr>
-          <w:rFonts w:ascii="Calibri" w:hAnsi="Cambria Math" w:cs="Times New Roman"/>
+      <w:r>
+        <w:rPr>
+          <w:rFonts w:ascii="Times New Roman" w:hAnsi="Times New Roman" w:cs="Times New Roman"/>
           <w:sz w:val="24"/>
           <w:szCs w:val="24"/>
         </w:rPr>
         <w:t>кг</w:t>
       </w:r>
-      <w:proofErr w:type="gramEnd"/>
     </w:p>
     <w:p>
       <w:pPr>
@@ -14453,7 +14396,7 @@
       </m:oMath>
       <w:r>
         <w:rPr>
-          <w:rFonts w:ascii="Calibri" w:hAnsi="Cambria Math" w:cs="Times New Roman"/>
+          <w:rFonts w:ascii="Times New Roman" w:hAnsi="Times New Roman" w:cs="Times New Roman"/>
           <w:sz w:val="24"/>
           <w:szCs w:val="24"/>
         </w:rPr>
@@ -14461,19 +14404,13 @@
       </w:r>
       <w:r>
         <w:rPr>
-          <w:rFonts w:ascii="Arial" w:hAnsi="Arial" w:cs="Arial"/>
-        </w:rPr>
-        <w:t>26928,9</w:t>
-      </w:r>
-      <w:r>
-        <w:rPr>
-          <w:rFonts w:ascii="Arial" w:hAnsi="Arial" w:cs="Arial"/>
-        </w:rPr>
-        <w:t xml:space="preserve"> </w:t>
-      </w:r>
-      <w:r>
-        <w:rPr>
-          <w:rFonts w:ascii="Arial" w:hAnsi="Arial" w:cs="Arial"/>
+          <w:rFonts w:ascii="Times New Roman" w:hAnsi="Times New Roman" w:cs="Times New Roman"/>
+        </w:rPr>
+        <w:t xml:space="preserve">26928,9 </w:t>
+      </w:r>
+      <w:r>
+        <w:rPr>
+          <w:rFonts w:ascii="Times New Roman" w:hAnsi="Times New Roman" w:cs="Times New Roman"/>
           <w:sz w:val="24"/>
           <w:szCs w:val="24"/>
         </w:rPr>
@@ -14553,7 +14490,23 @@
           <w:sz w:val="24"/>
           <w:szCs w:val="24"/>
         </w:rPr>
-        <w:t xml:space="preserve"> = кг</w:t>
+        <w:t xml:space="preserve"> =</w:t>
+      </w:r>
+      <w:r>
+        <w:rPr>
+          <w:rFonts w:ascii="Times New Roman" w:hAnsi="Times New Roman" w:cs="Times New Roman"/>
+          <w:sz w:val="24"/>
+          <w:szCs w:val="24"/>
+        </w:rPr>
+        <w:t xml:space="preserve"> 5143,4</w:t>
+      </w:r>
+      <w:r>
+        <w:rPr>
+          <w:rFonts w:ascii="Times New Roman" w:hAnsi="Times New Roman" w:cs="Times New Roman"/>
+          <w:sz w:val="24"/>
+          <w:szCs w:val="24"/>
+        </w:rPr>
+        <w:t xml:space="preserve"> кг</w:t>
       </w:r>
     </w:p>
     <w:p>
@@ -14571,15 +14524,7 @@
           <w:sz w:val="24"/>
           <w:szCs w:val="24"/>
         </w:rPr>
-        <w:t>Масса топлива</w:t>
-      </w:r>
-      <w:r>
-        <w:rPr>
-          <w:rFonts w:ascii="Times New Roman" w:hAnsi="Times New Roman" w:cs="Times New Roman"/>
-          <w:sz w:val="24"/>
-          <w:szCs w:val="24"/>
-        </w:rPr>
-        <w:t xml:space="preserve"> первой ступени, </w:t>
+        <w:t xml:space="preserve">Масса топлива первой ступени, </w:t>
       </w:r>
       <m:oMath>
         <m:sSub>
@@ -14617,7 +14562,7 @@
       </m:oMath>
       <w:r>
         <w:rPr>
-          <w:rFonts w:ascii="Calibri" w:hAnsi="Cambria Math" w:cs="Times New Roman"/>
+          <w:rFonts w:ascii="Times New Roman" w:hAnsi="Times New Roman" w:cs="Times New Roman"/>
           <w:sz w:val="24"/>
           <w:szCs w:val="24"/>
         </w:rPr>
@@ -14667,7 +14612,7 @@
       </m:oMath>
       <w:r>
         <w:rPr>
-          <w:rFonts w:ascii="Calibri" w:hAnsi="Cambria Math" w:cs="Times New Roman"/>
+          <w:rFonts w:ascii="Times New Roman" w:hAnsi="Times New Roman" w:cs="Times New Roman"/>
           <w:sz w:val="24"/>
           <w:szCs w:val="24"/>
         </w:rPr>
@@ -14709,36 +14654,34 @@
       </m:oMath>
       <w:r>
         <w:rPr>
-          <w:rFonts w:ascii="Calibri" w:hAnsi="Cambria Math" w:cs="Times New Roman"/>
-          <w:sz w:val="24"/>
-          <w:szCs w:val="24"/>
-        </w:rPr>
-        <w:t xml:space="preserve"> </w:t>
-      </w:r>
-      <w:proofErr w:type="gramStart"/>
-      <w:r>
-        <w:rPr>
-          <w:rFonts w:ascii="Calibri" w:hAnsi="Cambria Math" w:cs="Times New Roman"/>
-          <w:sz w:val="24"/>
-          <w:szCs w:val="24"/>
-        </w:rPr>
-        <w:t xml:space="preserve">=  </w:t>
-      </w:r>
-      <w:r>
-        <w:rPr>
-          <w:rFonts w:ascii="Calibri" w:hAnsi="Cambria Math" w:cs="Times New Roman"/>
-          <w:sz w:val="24"/>
-          <w:szCs w:val="24"/>
-        </w:rPr>
-        <w:t>кг</w:t>
-      </w:r>
-      <w:proofErr w:type="gramEnd"/>
+          <w:rFonts w:ascii="Times New Roman" w:hAnsi="Times New Roman" w:cs="Times New Roman"/>
+          <w:sz w:val="24"/>
+          <w:szCs w:val="24"/>
+        </w:rPr>
+        <w:t xml:space="preserve"> = </w:t>
+      </w:r>
+      <w:r>
+        <w:rPr>
+          <w:rFonts w:ascii="Times New Roman" w:hAnsi="Times New Roman" w:cs="Times New Roman"/>
+          <w:sz w:val="24"/>
+          <w:szCs w:val="24"/>
+        </w:rPr>
+        <w:t>21785,5</w:t>
+      </w:r>
+      <w:r>
+        <w:rPr>
+          <w:rFonts w:ascii="Times New Roman" w:hAnsi="Times New Roman" w:cs="Times New Roman"/>
+          <w:sz w:val="24"/>
+          <w:szCs w:val="24"/>
+        </w:rPr>
+        <w:t xml:space="preserve"> кг</w:t>
+      </w:r>
     </w:p>
     <w:p>
       <w:pPr>
         <w:spacing w:after="0" w:line="240" w:lineRule="auto"/>
         <w:rPr>
-          <w:rFonts w:ascii="Calibri" w:eastAsiaTheme="minorEastAsia" w:hAnsi="Cambria Math" w:cs="Times New Roman"/>
+          <w:rFonts w:ascii="Times New Roman" w:eastAsiaTheme="minorEastAsia" w:hAnsi="Times New Roman" w:cs="Times New Roman"/>
           <w:sz w:val="24"/>
           <w:szCs w:val="24"/>
         </w:rPr>
@@ -14799,15 +14742,7 @@
             <w:sz w:val="24"/>
             <w:szCs w:val="24"/>
           </w:rPr>
-          <m:t>= 0,</m:t>
-        </m:r>
-        <m:r>
-          <w:rPr>
-            <w:rFonts w:ascii="Cambria Math" w:eastAsiaTheme="minorEastAsia" w:hAnsi="Cambria Math" w:cs="Times New Roman"/>
-            <w:sz w:val="24"/>
-            <w:szCs w:val="24"/>
-          </w:rPr>
-          <m:t>3580</m:t>
+          <m:t>= 0,3580</m:t>
         </m:r>
       </m:oMath>
     </w:p>
@@ -14815,7 +14750,7 @@
       <w:pPr>
         <w:spacing w:after="0" w:line="240" w:lineRule="auto"/>
         <w:rPr>
-          <w:rFonts w:ascii="Calibri" w:eastAsiaTheme="minorEastAsia" w:hAnsi="Cambria Math" w:cs="Times New Roman"/>
+          <w:rFonts w:ascii="Times New Roman" w:eastAsiaTheme="minorEastAsia" w:hAnsi="Times New Roman" w:cs="Times New Roman"/>
           <w:sz w:val="24"/>
           <w:szCs w:val="24"/>
         </w:rPr>
@@ -14876,15 +14811,7 @@
             <w:sz w:val="24"/>
             <w:szCs w:val="24"/>
           </w:rPr>
-          <m:t>= 0,</m:t>
-        </m:r>
-        <m:r>
-          <w:rPr>
-            <w:rFonts w:ascii="Cambria Math" w:eastAsiaTheme="minorEastAsia" w:hAnsi="Cambria Math" w:cs="Times New Roman"/>
-            <w:sz w:val="24"/>
-            <w:szCs w:val="24"/>
-          </w:rPr>
-          <m:t>1910</m:t>
+          <m:t>= 0,1910</m:t>
         </m:r>
       </m:oMath>
     </w:p>
@@ -15146,6 +15073,14 @@
       </w:r>
       <w:r>
         <w:rPr>
+          <w:rFonts w:ascii="Times New Roman" w:hAnsi="Times New Roman" w:cs="Times New Roman"/>
+          <w:sz w:val="24"/>
+          <w:szCs w:val="24"/>
+        </w:rPr>
+        <w:t xml:space="preserve">57627,8 </w:t>
+      </w:r>
+      <w:r>
+        <w:rPr>
           <w:rFonts w:ascii="Calibri" w:hAnsi="Cambria Math" w:cs="Times New Roman"/>
           <w:sz w:val="24"/>
           <w:szCs w:val="24"/>
@@ -15290,34 +15225,32 @@
           <w:sz w:val="24"/>
           <w:szCs w:val="24"/>
         </w:rPr>
+        <w:t xml:space="preserve"> = </w:t>
+      </w:r>
+      <w:r>
+        <w:rPr>
+          <w:rFonts w:ascii="Times New Roman" w:hAnsi="Times New Roman" w:cs="Times New Roman"/>
+          <w:sz w:val="24"/>
+          <w:szCs w:val="24"/>
+        </w:rPr>
+        <w:t>21785,5</w:t>
+      </w:r>
+      <w:r>
+        <w:rPr>
+          <w:rFonts w:ascii="Calibri" w:hAnsi="Cambria Math" w:cs="Times New Roman"/>
+          <w:sz w:val="24"/>
+          <w:szCs w:val="24"/>
+        </w:rPr>
         <w:t xml:space="preserve"> </w:t>
       </w:r>
-      <w:proofErr w:type="gramStart"/>
       <w:r>
         <w:rPr>
           <w:rFonts w:ascii="Calibri" w:hAnsi="Cambria Math" w:cs="Times New Roman"/>
           <w:sz w:val="24"/>
           <w:szCs w:val="24"/>
         </w:rPr>
-        <w:t xml:space="preserve">= </w:t>
-      </w:r>
-      <w:r>
-        <w:rPr>
-          <w:rFonts w:ascii="Calibri" w:hAnsi="Cambria Math" w:cs="Times New Roman"/>
-          <w:sz w:val="24"/>
-          <w:szCs w:val="24"/>
-        </w:rPr>
-        <w:t xml:space="preserve"> </w:t>
-      </w:r>
-      <w:r>
-        <w:rPr>
-          <w:rFonts w:ascii="Calibri" w:hAnsi="Cambria Math" w:cs="Times New Roman"/>
-          <w:sz w:val="24"/>
-          <w:szCs w:val="24"/>
-        </w:rPr>
         <w:t>кг</w:t>
       </w:r>
-      <w:proofErr w:type="gramEnd"/>
     </w:p>
     <w:p>
       <w:pPr>
@@ -15416,38 +15349,14 @@
             </m:r>
           </m:e>
           <m:sub>
-            <m:sSub>
-              <m:sSubPr>
-                <m:ctrlPr>
-                  <w:rPr>
-                    <w:rFonts w:ascii="Cambria Math" w:hAnsi="Cambria Math" w:cs="Times New Roman"/>
-                    <w:i/>
-                    <w:sz w:val="24"/>
-                    <w:szCs w:val="24"/>
-                  </w:rPr>
-                </m:ctrlPr>
-              </m:sSubPr>
-              <m:e>
-                <m:r>
-                  <w:rPr>
-                    <w:rFonts w:ascii="Cambria Math" w:hAnsi="Cambria Math" w:cs="Times New Roman"/>
-                    <w:sz w:val="24"/>
-                    <w:szCs w:val="24"/>
-                  </w:rPr>
-                  <m:t>O</m:t>
-                </m:r>
-              </m:e>
-              <m:sub>
-                <m:r>
-                  <w:rPr>
-                    <w:rFonts w:ascii="Cambria Math" w:hAnsi="Cambria Math" w:cs="Times New Roman"/>
-                    <w:sz w:val="24"/>
-                    <w:szCs w:val="24"/>
-                  </w:rPr>
-                  <m:t>2</m:t>
-                </m:r>
-              </m:sub>
-            </m:sSub>
+            <m:r>
+              <w:rPr>
+                <w:rFonts w:ascii="Cambria Math" w:hAnsi="Cambria Math" w:cs="Times New Roman"/>
+                <w:sz w:val="24"/>
+                <w:szCs w:val="24"/>
+              </w:rPr>
+              <m:t>о</m:t>
+            </m:r>
           </m:sub>
         </m:sSub>
       </m:oMath>
@@ -15559,26 +15468,19 @@
       <w:pPr>
         <w:spacing w:after="0" w:line="240" w:lineRule="auto"/>
         <w:rPr>
-          <w:rFonts w:ascii="Times New Roman" w:eastAsiaTheme="minorEastAsia" w:hAnsi="Times New Roman" w:cs="Times New Roman"/>
-          <w:sz w:val="24"/>
-          <w:szCs w:val="24"/>
-        </w:rPr>
-      </w:pPr>
-      <w:r>
-        <w:rPr>
-          <w:rFonts w:ascii="Times New Roman" w:hAnsi="Times New Roman" w:cs="Times New Roman"/>
-          <w:sz w:val="24"/>
-          <w:szCs w:val="24"/>
-        </w:rPr>
-        <w:t>Радиусы баков</w:t>
-      </w:r>
-      <w:r>
-        <w:rPr>
-          <w:rFonts w:ascii="Times New Roman" w:hAnsi="Times New Roman" w:cs="Times New Roman"/>
-          <w:sz w:val="24"/>
-          <w:szCs w:val="24"/>
-        </w:rPr>
-        <w:t xml:space="preserve">  </w:t>
+          <w:rFonts w:ascii="Times New Roman" w:hAnsi="Times New Roman" w:cs="Times New Roman"/>
+          <w:sz w:val="24"/>
+          <w:szCs w:val="24"/>
+          <w:lang w:val="en-US"/>
+        </w:rPr>
+      </w:pPr>
+      <w:r>
+        <w:rPr>
+          <w:rFonts w:ascii="Times New Roman" w:hAnsi="Times New Roman" w:cs="Times New Roman"/>
+          <w:sz w:val="24"/>
+          <w:szCs w:val="24"/>
+        </w:rPr>
+        <w:t xml:space="preserve">Радиусы баков  </w:t>
       </w:r>
       <m:oMath>
         <m:r>
@@ -15592,29 +15494,46 @@
       </m:oMath>
       <w:r>
         <w:rPr>
-          <w:rFonts w:ascii="Calibri" w:hAnsi="Cambria Math" w:cs="Times New Roman"/>
+          <w:rFonts w:ascii="Times New Roman" w:hAnsi="Times New Roman" w:cs="Times New Roman"/>
+          <w:sz w:val="24"/>
+          <w:szCs w:val="24"/>
+        </w:rPr>
+        <w:t xml:space="preserve"> =</w:t>
+      </w:r>
+      <w:r>
+        <w:rPr>
+          <w:rFonts w:ascii="Times New Roman" w:hAnsi="Times New Roman" w:cs="Times New Roman"/>
+          <w:sz w:val="24"/>
+          <w:szCs w:val="24"/>
+          <w:lang w:val="en-US"/>
+        </w:rPr>
+        <w:t xml:space="preserve"> 1</w:t>
+      </w:r>
+      <w:r>
+        <w:rPr>
+          <w:rFonts w:ascii="Times New Roman" w:hAnsi="Times New Roman" w:cs="Times New Roman"/>
+          <w:sz w:val="24"/>
+          <w:szCs w:val="24"/>
+        </w:rPr>
+        <w:t>,</w:t>
+      </w:r>
+      <w:r>
+        <w:rPr>
+          <w:rFonts w:ascii="Times New Roman" w:hAnsi="Times New Roman" w:cs="Times New Roman"/>
+          <w:sz w:val="24"/>
+          <w:szCs w:val="24"/>
+          <w:lang w:val="en-US"/>
+        </w:rPr>
+        <w:t>2</w:t>
+      </w:r>
+      <w:r>
+        <w:rPr>
+          <w:rFonts w:ascii="Times New Roman" w:hAnsi="Times New Roman" w:cs="Times New Roman"/>
           <w:sz w:val="24"/>
           <w:szCs w:val="24"/>
         </w:rPr>
         <w:t xml:space="preserve"> </w:t>
       </w:r>
-      <w:proofErr w:type="gramStart"/>
-      <w:r>
-        <w:rPr>
-          <w:rFonts w:ascii="Calibri" w:hAnsi="Cambria Math" w:cs="Times New Roman"/>
-          <w:sz w:val="24"/>
-          <w:szCs w:val="24"/>
-        </w:rPr>
-        <w:t xml:space="preserve">= </w:t>
-      </w:r>
-      <w:r>
-        <w:rPr>
-          <w:rFonts w:ascii="Calibri" w:hAnsi="Cambria Math" w:cs="Times New Roman"/>
-          <w:sz w:val="24"/>
-          <w:szCs w:val="24"/>
-        </w:rPr>
-        <w:t xml:space="preserve"> </w:t>
-      </w:r>
       <w:r>
         <w:rPr>
           <w:rFonts w:ascii="Times New Roman" w:hAnsi="Times New Roman" w:cs="Times New Roman"/>
@@ -15623,7 +15542,6 @@
         </w:rPr>
         <w:t>м</w:t>
       </w:r>
-      <w:proofErr w:type="gramEnd"/>
     </w:p>
     <w:p>
       <w:pPr>
@@ -15640,7 +15558,23 @@
           <w:sz w:val="24"/>
           <w:szCs w:val="24"/>
         </w:rPr>
-        <w:t xml:space="preserve">Масса топлива ступени </w:t>
+        <w:t>Масса топлива</w:t>
+      </w:r>
+      <w:r>
+        <w:rPr>
+          <w:rFonts w:ascii="Times New Roman" w:hAnsi="Times New Roman" w:cs="Times New Roman"/>
+          <w:sz w:val="24"/>
+          <w:szCs w:val="24"/>
+        </w:rPr>
+        <w:t xml:space="preserve"> 1</w:t>
+      </w:r>
+      <w:r>
+        <w:rPr>
+          <w:rFonts w:ascii="Times New Roman" w:hAnsi="Times New Roman" w:cs="Times New Roman"/>
+          <w:sz w:val="24"/>
+          <w:szCs w:val="24"/>
+        </w:rPr>
+        <w:t xml:space="preserve"> ступени </w:t>
       </w:r>
       <m:oMath>
         <m:sSub>
@@ -15673,8 +15607,24 @@
               </w:rPr>
               <m:t>Т</m:t>
             </m:r>
+            <m:r>
+              <w:rPr>
+                <w:rFonts w:ascii="Cambria Math" w:hAnsi="Cambria Math" w:cs="Times New Roman"/>
+                <w:sz w:val="24"/>
+                <w:szCs w:val="24"/>
+              </w:rPr>
+              <m:t>1</m:t>
+            </m:r>
           </m:sub>
         </m:sSub>
+        <m:r>
+          <w:rPr>
+            <w:rFonts w:ascii="Cambria Math" w:eastAsiaTheme="minorEastAsia" w:hAnsi="Cambria Math" w:cs="Times New Roman"/>
+            <w:sz w:val="24"/>
+            <w:szCs w:val="24"/>
+          </w:rPr>
+          <m:t>=57627,8 кг</m:t>
+        </m:r>
       </m:oMath>
     </w:p>
     <w:p>
@@ -16029,7 +15979,39 @@
             <w:sz w:val="24"/>
             <w:szCs w:val="24"/>
           </w:rPr>
-          <m:t xml:space="preserve"> *51372,53 = 38255,58</m:t>
+          <m:t xml:space="preserve"> *</m:t>
+        </m:r>
+        <m:r>
+          <w:rPr>
+            <w:rFonts w:ascii="Cambria Math" w:eastAsiaTheme="minorEastAsia" w:hAnsi="Cambria Math" w:cs="Times New Roman"/>
+            <w:sz w:val="24"/>
+            <w:szCs w:val="24"/>
+          </w:rPr>
+          <m:t>57627,8</m:t>
+        </m:r>
+        <m:r>
+          <w:rPr>
+            <w:rFonts w:ascii="Cambria Math" w:hAnsi="Cambria Math" w:cs="Times New Roman"/>
+            <w:sz w:val="24"/>
+            <w:szCs w:val="24"/>
+          </w:rPr>
+          <m:t xml:space="preserve"> = </m:t>
+        </m:r>
+        <m:r>
+          <w:rPr>
+            <w:rFonts w:ascii="Cambria Math" w:hAnsi="Cambria Math" w:cs="Times New Roman"/>
+            <w:sz w:val="24"/>
+            <w:szCs w:val="24"/>
+          </w:rPr>
+          <m:t>42 913,</m:t>
+        </m:r>
+        <m:r>
+          <w:rPr>
+            <w:rFonts w:ascii="Cambria Math" w:hAnsi="Cambria Math" w:cs="Times New Roman"/>
+            <w:sz w:val="24"/>
+            <w:szCs w:val="24"/>
+          </w:rPr>
+          <m:t>7</m:t>
         </m:r>
       </m:oMath>
       <w:r>
@@ -16220,7 +16202,47 @@
             <w:sz w:val="24"/>
             <w:szCs w:val="24"/>
           </w:rPr>
-          <m:t xml:space="preserve"> *51372,53 = 13116,94 </m:t>
+          <m:t xml:space="preserve"> *</m:t>
+        </m:r>
+        <m:r>
+          <w:rPr>
+            <w:rFonts w:ascii="Cambria Math" w:eastAsiaTheme="minorEastAsia" w:hAnsi="Cambria Math" w:cs="Times New Roman"/>
+            <w:sz w:val="24"/>
+            <w:szCs w:val="24"/>
+          </w:rPr>
+          <m:t>57627,8</m:t>
+        </m:r>
+        <m:r>
+          <w:rPr>
+            <w:rFonts w:ascii="Cambria Math" w:hAnsi="Cambria Math" w:cs="Times New Roman"/>
+            <w:sz w:val="24"/>
+            <w:szCs w:val="24"/>
+          </w:rPr>
+          <m:t xml:space="preserve"> </m:t>
+        </m:r>
+        <m:r>
+          <w:rPr>
+            <w:rFonts w:ascii="Cambria Math" w:hAnsi="Cambria Math" w:cs="Times New Roman"/>
+            <w:sz w:val="24"/>
+            <w:szCs w:val="24"/>
+          </w:rPr>
+          <m:t xml:space="preserve">= </m:t>
+        </m:r>
+        <m:r>
+          <w:rPr>
+            <w:rFonts w:ascii="Cambria Math" w:hAnsi="Cambria Math" w:cs="Times New Roman"/>
+            <w:sz w:val="24"/>
+            <w:szCs w:val="24"/>
+          </w:rPr>
+          <m:t>14 714,1</m:t>
+        </m:r>
+        <m:r>
+          <w:rPr>
+            <w:rFonts w:ascii="Cambria Math" w:hAnsi="Cambria Math" w:cs="Times New Roman"/>
+            <w:sz w:val="24"/>
+            <w:szCs w:val="24"/>
+          </w:rPr>
+          <m:t xml:space="preserve"> </m:t>
         </m:r>
       </m:oMath>
       <w:r>
@@ -16405,7 +16427,15 @@
                 <w:sz w:val="24"/>
                 <w:szCs w:val="24"/>
               </w:rPr>
-              <m:t>38255,58</m:t>
+              <m:t>42 913,</m:t>
+            </m:r>
+            <m:r>
+              <w:rPr>
+                <w:rFonts w:ascii="Cambria Math" w:hAnsi="Cambria Math" w:cs="Times New Roman"/>
+                <w:sz w:val="24"/>
+                <w:szCs w:val="24"/>
+              </w:rPr>
+              <m:t>7</m:t>
             </m:r>
           </m:num>
           <m:den>
@@ -16425,7 +16455,23 @@
             <w:sz w:val="24"/>
             <w:szCs w:val="24"/>
           </w:rPr>
-          <m:t xml:space="preserve"> = 26,56 </m:t>
+          <m:t xml:space="preserve"> = </m:t>
+        </m:r>
+        <m:r>
+          <w:rPr>
+            <w:rFonts w:ascii="Cambria Math" w:hAnsi="Cambria Math" w:cs="Times New Roman"/>
+            <w:sz w:val="24"/>
+            <w:szCs w:val="24"/>
+          </w:rPr>
+          <m:t>29,8</m:t>
+        </m:r>
+        <m:r>
+          <w:rPr>
+            <w:rFonts w:ascii="Cambria Math" w:hAnsi="Cambria Math" w:cs="Times New Roman"/>
+            <w:sz w:val="24"/>
+            <w:szCs w:val="24"/>
+          </w:rPr>
+          <m:t xml:space="preserve"> </m:t>
         </m:r>
       </m:oMath>
       <w:r>
@@ -16626,7 +16672,7 @@
                 <w:sz w:val="24"/>
                 <w:szCs w:val="24"/>
               </w:rPr>
-              <m:t>13116,94</m:t>
+              <m:t>14 714,1</m:t>
             </m:r>
           </m:num>
           <m:den>
@@ -16646,7 +16692,15 @@
             <w:sz w:val="24"/>
             <w:szCs w:val="24"/>
           </w:rPr>
-          <m:t xml:space="preserve"> = 16,6</m:t>
+          <m:t xml:space="preserve"> = </m:t>
+        </m:r>
+        <m:r>
+          <w:rPr>
+            <w:rFonts w:ascii="Cambria Math" w:hAnsi="Cambria Math" w:cs="Times New Roman"/>
+            <w:sz w:val="24"/>
+            <w:szCs w:val="24"/>
+          </w:rPr>
+          <m:t>18,6</m:t>
         </m:r>
       </m:oMath>
       <w:r>
@@ -17050,7 +17104,15 @@
           <w:sz w:val="24"/>
           <w:szCs w:val="24"/>
         </w:rPr>
-        <w:t>28,41</w:t>
+        <w:t>31,</w:t>
+      </w:r>
+      <w:r>
+        <w:rPr>
+          <w:rFonts w:ascii="Calibri" w:hAnsi="Cambria Math" w:cs="Times New Roman"/>
+          <w:sz w:val="24"/>
+          <w:szCs w:val="24"/>
+        </w:rPr>
+        <w:t>9</w:t>
       </w:r>
       <w:r>
         <w:rPr>
@@ -17103,7 +17165,7 @@
             <w:sz w:val="24"/>
             <w:szCs w:val="24"/>
           </w:rPr>
-          <m:t xml:space="preserve">,    </m:t>
+          <m:t xml:space="preserve">, </m:t>
         </m:r>
       </m:oMath>
     </w:p>
@@ -17114,6 +17176,7 @@
           <w:rFonts w:hAnsi="Cambria Math" w:cs="Times New Roman"/>
           <w:sz w:val="24"/>
           <w:szCs w:val="24"/>
+          <w:lang w:val="en-US"/>
         </w:rPr>
       </w:pPr>
       <m:oMathPara>
@@ -17453,7 +17516,7 @@
           <w:sz w:val="24"/>
           <w:szCs w:val="24"/>
         </w:rPr>
-        <w:t>17,8</w:t>
+        <w:t>19,9</w:t>
       </w:r>
       <w:r>
         <w:rPr>
@@ -18363,7 +18426,15 @@
             <w:sz w:val="24"/>
             <w:szCs w:val="24"/>
           </w:rPr>
-          <m:t>=26,01</m:t>
+          <m:t>=</m:t>
+        </m:r>
+        <m:r>
+          <w:rPr>
+            <w:rFonts w:ascii="Cambria Math" w:eastAsiaTheme="minorEastAsia" w:hAnsi="Cambria Math" w:cs="Times New Roman"/>
+            <w:sz w:val="24"/>
+            <w:szCs w:val="24"/>
+          </w:rPr>
+          <m:t>29,5</m:t>
         </m:r>
         <m:sSup>
           <m:sSupPr>
@@ -18598,7 +18669,29 @@
             <w:sz w:val="24"/>
             <w:szCs w:val="24"/>
           </w:rPr>
-          <m:t xml:space="preserve"> 5,75</m:t>
+          <m:t xml:space="preserve"> </m:t>
+        </m:r>
+        <m:r>
+          <m:rPr>
+            <m:sty m:val="p"/>
+          </m:rPr>
+          <w:rPr>
+            <w:rFonts w:ascii="Cambria Math" w:hAnsi="Cambria Math" w:cs="Times New Roman"/>
+            <w:sz w:val="24"/>
+            <w:szCs w:val="24"/>
+          </w:rPr>
+          <m:t>6,5</m:t>
+        </m:r>
+        <m:r>
+          <m:rPr>
+            <m:sty m:val="p"/>
+          </m:rPr>
+          <w:rPr>
+            <w:rFonts w:ascii="Cambria Math" w:hAnsi="Cambria Math" w:cs="Times New Roman"/>
+            <w:sz w:val="24"/>
+            <w:szCs w:val="24"/>
+          </w:rPr>
+          <m:t xml:space="preserve"> </m:t>
         </m:r>
       </m:oMath>
       <w:r>
@@ -18765,9 +18858,33 @@
             <w:sz w:val="24"/>
             <w:szCs w:val="24"/>
           </w:rPr>
-          <m:t xml:space="preserve"> = 6,75</m:t>
+          <m:t xml:space="preserve"> = </m:t>
+        </m:r>
+        <m:r>
+          <w:rPr>
+            <w:rFonts w:ascii="Cambria Math" w:hAnsi="Cambria Math" w:cs="Times New Roman"/>
+            <w:sz w:val="24"/>
+            <w:szCs w:val="24"/>
+          </w:rPr>
+          <m:t>7</m:t>
+        </m:r>
+        <m:r>
+          <w:rPr>
+            <w:rFonts w:ascii="Cambria Math" w:hAnsi="Cambria Math" w:cs="Times New Roman"/>
+            <w:sz w:val="24"/>
+            <w:szCs w:val="24"/>
+          </w:rPr>
+          <m:t>,5</m:t>
         </m:r>
       </m:oMath>
+      <w:r>
+        <w:rPr>
+          <w:rFonts w:ascii="Calibri" w:eastAsiaTheme="minorEastAsia" w:hAnsi="Cambria Math" w:cs="Times New Roman"/>
+          <w:sz w:val="24"/>
+          <w:szCs w:val="24"/>
+        </w:rPr>
+        <w:t xml:space="preserve"> </w:t>
+      </w:r>
       <w:r>
         <w:rPr>
           <w:rFonts w:ascii="Calibri" w:hAnsi="Cambria Math" w:cs="Times New Roman"/>
@@ -18811,7 +18928,6 @@
             <w:sz w:val="24"/>
             <w:szCs w:val="24"/>
           </w:rPr>
-          <w:lastRenderedPageBreak/>
           <m:t xml:space="preserve">                                               </m:t>
         </m:r>
         <m:sSub>
@@ -18892,7 +19008,18 @@
             <w:sz w:val="24"/>
             <w:szCs w:val="24"/>
           </w:rPr>
-          <m:t xml:space="preserve"> = 17,8</m:t>
+          <m:t xml:space="preserve"> = </m:t>
+        </m:r>
+        <m:r>
+          <m:rPr>
+            <m:sty m:val="p"/>
+          </m:rPr>
+          <w:rPr>
+            <w:rFonts w:ascii="Cambria Math" w:hAnsi="Cambria Math" w:cs="Times New Roman"/>
+            <w:sz w:val="24"/>
+            <w:szCs w:val="24"/>
+          </w:rPr>
+          <m:t xml:space="preserve">19,9 </m:t>
         </m:r>
       </m:oMath>
       <w:r>
@@ -18928,6 +19055,7 @@
           <w:sz w:val="24"/>
           <w:szCs w:val="24"/>
         </w:rPr>
+        <w:lastRenderedPageBreak/>
         <w:t>Длина цилиндрической части бака горючего,</w:t>
       </w:r>
     </w:p>
@@ -19091,7 +19219,15 @@
             <w:sz w:val="24"/>
             <w:szCs w:val="24"/>
           </w:rPr>
-          <m:t xml:space="preserve"> = 3,935</m:t>
+          <m:t xml:space="preserve"> = </m:t>
+        </m:r>
+        <m:r>
+          <w:rPr>
+            <w:rFonts w:ascii="Cambria Math" w:hAnsi="Cambria Math" w:cs="Times New Roman"/>
+            <w:sz w:val="24"/>
+            <w:szCs w:val="24"/>
+          </w:rPr>
+          <m:t>4,4</m:t>
         </m:r>
       </m:oMath>
       <w:r>
@@ -19247,7 +19383,31 @@
             <w:sz w:val="24"/>
             <w:szCs w:val="24"/>
           </w:rPr>
-          <m:t xml:space="preserve"> = 4,435 </m:t>
+          <m:t xml:space="preserve"> = </m:t>
+        </m:r>
+        <m:r>
+          <w:rPr>
+            <w:rFonts w:ascii="Cambria Math" w:hAnsi="Cambria Math" w:cs="Times New Roman"/>
+            <w:sz w:val="24"/>
+            <w:szCs w:val="24"/>
+          </w:rPr>
+          <m:t>4,</m:t>
+        </m:r>
+        <m:r>
+          <w:rPr>
+            <w:rFonts w:ascii="Cambria Math" w:hAnsi="Cambria Math" w:cs="Times New Roman"/>
+            <w:sz w:val="24"/>
+            <w:szCs w:val="24"/>
+          </w:rPr>
+          <m:t>9</m:t>
+        </m:r>
+        <m:r>
+          <w:rPr>
+            <w:rFonts w:ascii="Cambria Math" w:hAnsi="Cambria Math" w:cs="Times New Roman"/>
+            <w:sz w:val="24"/>
+            <w:szCs w:val="24"/>
+          </w:rPr>
+          <m:t xml:space="preserve"> </m:t>
         </m:r>
       </m:oMath>
       <w:r>
@@ -20087,17 +20247,33 @@
             <w:sz w:val="24"/>
             <w:szCs w:val="24"/>
           </w:rPr>
-          <m:t xml:space="preserve"> = 86,5</m:t>
+          <m:t xml:space="preserve"> = </m:t>
+        </m:r>
+        <m:r>
+          <m:rPr>
+            <m:sty m:val="p"/>
+          </m:rPr>
+          <w:rPr>
+            <w:rFonts w:ascii="Cambria Math" w:hAnsi="Cambria Math"/>
+            <w:sz w:val="24"/>
+            <w:szCs w:val="24"/>
+            <w:lang w:eastAsia="zh-CN"/>
+          </w:rPr>
+          <m:t>93,8</m:t>
+        </m:r>
+        <m:r>
+          <m:rPr>
+            <m:sty m:val="p"/>
+          </m:rPr>
+          <w:rPr>
+            <w:rFonts w:ascii="Cambria Math" w:hAnsi="Times New Roman"/>
+            <w:sz w:val="24"/>
+            <w:szCs w:val="24"/>
+            <w:lang w:eastAsia="zh-CN"/>
+          </w:rPr>
+          <m:t xml:space="preserve"> </m:t>
         </m:r>
       </m:oMath>
-      <w:r>
-        <w:rPr>
-          <w:rFonts w:ascii="Calibri" w:hAnsi="Cambria Math" w:cs="Courier New"/>
-          <w:sz w:val="24"/>
-          <w:szCs w:val="24"/>
-        </w:rPr>
-        <w:t xml:space="preserve"> </w:t>
-      </w:r>
       <w:r>
         <w:rPr>
           <w:rFonts w:ascii="Calibri" w:hAnsi="Cambria Math" w:cs="Courier New"/>
@@ -20283,25 +20459,30 @@
           </m:fPr>
           <m:num>
             <m:r>
-              <w:rPr>
-                <w:rFonts w:ascii="Cambria Math" w:hAnsi="Cambria Math" w:cs="Times New Roman"/>
-                <w:sz w:val="24"/>
-                <w:szCs w:val="24"/>
-              </w:rPr>
-              <m:t>51372,52</m:t>
-            </m:r>
-          </m:num>
-          <m:den>
-            <m:r>
               <m:rPr>
                 <m:sty m:val="p"/>
               </m:rPr>
               <w:rPr>
-                <w:rFonts w:ascii="Cambria Math" w:hAnsi="Cambria Math" w:cs="Courier New"/>
-                <w:sz w:val="24"/>
-                <w:szCs w:val="24"/>
-              </w:rPr>
-              <m:t>86,5</m:t>
+                <w:rFonts w:ascii="Cambria Math" w:hAnsi="Cambria Math" w:cs="Times New Roman"/>
+                <w:sz w:val="24"/>
+                <w:szCs w:val="24"/>
+                <w:lang w:eastAsia="zh-CN"/>
+              </w:rPr>
+              <m:t xml:space="preserve">89762,9 </m:t>
+            </m:r>
+          </m:num>
+          <m:den>
+            <m:r>
+              <m:rPr>
+                <m:sty m:val="p"/>
+              </m:rPr>
+              <w:rPr>
+                <w:rFonts w:ascii="Cambria Math" w:hAnsi="Cambria Math"/>
+                <w:sz w:val="24"/>
+                <w:szCs w:val="24"/>
+                <w:lang w:eastAsia="zh-CN"/>
+              </w:rPr>
+              <m:t>93,8</m:t>
             </m:r>
           </m:den>
         </m:f>
@@ -20311,17 +20492,25 @@
             <w:sz w:val="24"/>
             <w:szCs w:val="24"/>
           </w:rPr>
-          <m:t xml:space="preserve"> = 593</m:t>
+          <m:t xml:space="preserve"> = </m:t>
+        </m:r>
+        <m:r>
+          <w:rPr>
+            <w:rFonts w:ascii="Cambria Math" w:hAnsi="Cambria Math" w:cs="Times New Roman"/>
+            <w:sz w:val="24"/>
+            <w:szCs w:val="24"/>
+          </w:rPr>
+          <m:t>956</m:t>
+        </m:r>
+        <m:r>
+          <w:rPr>
+            <w:rFonts w:ascii="Cambria Math" w:hAnsi="Cambria Math" w:cs="Times New Roman"/>
+            <w:sz w:val="24"/>
+            <w:szCs w:val="24"/>
+          </w:rPr>
+          <m:t>,96</m:t>
         </m:r>
       </m:oMath>
-      <w:r>
-        <w:rPr>
-          <w:rFonts w:ascii="Calibri" w:eastAsiaTheme="minorEastAsia" w:hAnsi="Cambria Math" w:cs="Courier New"/>
-          <w:sz w:val="24"/>
-          <w:szCs w:val="24"/>
-        </w:rPr>
-        <w:t>,9</w:t>
-      </w:r>
       <w:r>
         <w:rPr>
           <w:rFonts w:ascii="Calibri" w:hAnsi="Cambria Math" w:cs="Times New Roman"/>
@@ -20528,7 +20717,7 @@
                 <w:sz w:val="24"/>
                 <w:szCs w:val="24"/>
               </w:rPr>
-              <m:t>13116,94</m:t>
+              <m:t>14 714,1</m:t>
             </m:r>
           </m:num>
           <m:den>
@@ -20537,11 +20726,12 @@
                 <m:sty m:val="p"/>
               </m:rPr>
               <w:rPr>
-                <w:rFonts w:ascii="Cambria Math" w:hAnsi="Cambria Math" w:cs="Courier New"/>
-                <w:sz w:val="24"/>
-                <w:szCs w:val="24"/>
-              </w:rPr>
-              <m:t>86,5</m:t>
+                <w:rFonts w:ascii="Cambria Math" w:hAnsi="Cambria Math"/>
+                <w:sz w:val="24"/>
+                <w:szCs w:val="24"/>
+                <w:lang w:eastAsia="zh-CN"/>
+              </w:rPr>
+              <m:t>93,8</m:t>
             </m:r>
           </m:den>
         </m:f>
@@ -20551,7 +20741,23 @@
             <w:sz w:val="24"/>
             <w:szCs w:val="24"/>
           </w:rPr>
-          <m:t xml:space="preserve"> = 151,64</m:t>
+          <m:t xml:space="preserve"> = </m:t>
+        </m:r>
+        <m:r>
+          <w:rPr>
+            <w:rFonts w:ascii="Cambria Math" w:hAnsi="Cambria Math" w:cs="Times New Roman"/>
+            <w:sz w:val="24"/>
+            <w:szCs w:val="24"/>
+          </w:rPr>
+          <m:t>156,8</m:t>
+        </m:r>
+        <m:r>
+          <w:rPr>
+            <w:rFonts w:ascii="Cambria Math" w:hAnsi="Cambria Math" w:cs="Times New Roman"/>
+            <w:sz w:val="24"/>
+            <w:szCs w:val="24"/>
+          </w:rPr>
+          <m:t>7</m:t>
         </m:r>
       </m:oMath>
       <w:r>
@@ -20805,7 +21011,18 @@
                     <w:sz w:val="24"/>
                     <w:szCs w:val="24"/>
                   </w:rPr>
-                  <m:t>593,6</m:t>
+                  <m:t>956,96</m:t>
+                </m:r>
+                <m:r>
+                  <m:rPr>
+                    <m:sty m:val="p"/>
+                  </m:rPr>
+                  <w:rPr>
+                    <w:rFonts w:ascii="Cambria Math" w:hAnsi="Cambria Math" w:cs="Times New Roman"/>
+                    <w:sz w:val="24"/>
+                    <w:szCs w:val="24"/>
+                  </w:rPr>
+                  <m:t xml:space="preserve"> </m:t>
                 </m:r>
               </m:num>
               <m:den>
@@ -20827,7 +21044,15 @@
             <w:sz w:val="24"/>
             <w:szCs w:val="24"/>
           </w:rPr>
-          <m:t xml:space="preserve">  = 0,120</m:t>
+          <m:t xml:space="preserve">  = 0,</m:t>
+        </m:r>
+        <m:r>
+          <w:rPr>
+            <w:rFonts w:ascii="Cambria Math" w:hAnsi="Cambria Math" w:cs="Times New Roman"/>
+            <w:sz w:val="24"/>
+            <w:szCs w:val="24"/>
+          </w:rPr>
+          <m:t>152</m:t>
         </m:r>
       </m:oMath>
       <w:r>
@@ -20862,7 +21087,7 @@
           <w:sz w:val="24"/>
           <w:szCs w:val="24"/>
         </w:rPr>
-        <w:t xml:space="preserve">  </w:t>
+        <w:t xml:space="preserve"> </w:t>
       </w:r>
       <m:oMath>
         <m:sSub>
@@ -21088,7 +21313,15 @@
                     <w:sz w:val="24"/>
                     <w:szCs w:val="24"/>
                   </w:rPr>
-                  <m:t>151,64</m:t>
+                  <m:t>156,8</m:t>
+                </m:r>
+                <m:r>
+                  <w:rPr>
+                    <w:rFonts w:ascii="Cambria Math" w:hAnsi="Cambria Math" w:cs="Times New Roman"/>
+                    <w:sz w:val="24"/>
+                    <w:szCs w:val="24"/>
+                  </w:rPr>
+                  <m:t>7</m:t>
                 </m:r>
               </m:num>
               <m:den>
@@ -21110,7 +21343,23 @@
             <w:sz w:val="24"/>
             <w:szCs w:val="24"/>
           </w:rPr>
-          <m:t xml:space="preserve">  = 0,093 </m:t>
+          <m:t xml:space="preserve">  = 0,09</m:t>
+        </m:r>
+        <m:r>
+          <w:rPr>
+            <w:rFonts w:ascii="Cambria Math" w:hAnsi="Cambria Math" w:cs="Times New Roman"/>
+            <w:sz w:val="24"/>
+            <w:szCs w:val="24"/>
+          </w:rPr>
+          <m:t>5</m:t>
+        </m:r>
+        <m:r>
+          <w:rPr>
+            <w:rFonts w:ascii="Cambria Math" w:hAnsi="Cambria Math" w:cs="Times New Roman"/>
+            <w:sz w:val="24"/>
+            <w:szCs w:val="24"/>
+          </w:rPr>
+          <m:t xml:space="preserve"> </m:t>
         </m:r>
       </m:oMath>
       <w:r>
@@ -21179,7 +21428,31 @@
             <w:sz w:val="24"/>
             <w:szCs w:val="24"/>
           </w:rPr>
-          <m:t>= 0,120*0,25 = 0,03</m:t>
+          <m:t xml:space="preserve">= </m:t>
+        </m:r>
+        <m:r>
+          <w:rPr>
+            <w:rFonts w:ascii="Cambria Math" w:hAnsi="Cambria Math" w:cs="Times New Roman"/>
+            <w:sz w:val="24"/>
+            <w:szCs w:val="24"/>
+          </w:rPr>
+          <m:t>0,152</m:t>
+        </m:r>
+        <m:r>
+          <w:rPr>
+            <w:rFonts w:ascii="Cambria Math" w:hAnsi="Cambria Math" w:cs="Times New Roman"/>
+            <w:sz w:val="24"/>
+            <w:szCs w:val="24"/>
+          </w:rPr>
+          <m:t>*0,25 = 0,0</m:t>
+        </m:r>
+        <m:r>
+          <w:rPr>
+            <w:rFonts w:ascii="Cambria Math" w:hAnsi="Cambria Math" w:cs="Times New Roman"/>
+            <w:sz w:val="24"/>
+            <w:szCs w:val="24"/>
+          </w:rPr>
+          <m:t>38</m:t>
         </m:r>
       </m:oMath>
       <w:r>
@@ -21190,7 +21463,6 @@
         </w:rPr>
         <w:t xml:space="preserve"> </w:t>
       </w:r>
-      <w:proofErr w:type="gramStart"/>
       <w:r>
         <w:rPr>
           <w:rFonts w:ascii="Calibri" w:hAnsi="Cambria Math" w:cs="Times New Roman"/>
@@ -21205,9 +21477,8 @@
           <w:sz w:val="24"/>
           <w:szCs w:val="24"/>
         </w:rPr>
-        <w:t xml:space="preserve">,   </w:t>
-      </w:r>
-      <w:proofErr w:type="gramEnd"/>
+        <w:t xml:space="preserve">,  </w:t>
+      </w:r>
       <m:oMath>
         <m:sSub>
           <m:sSubPr>
@@ -21247,7 +21518,31 @@
             <w:sz w:val="24"/>
             <w:szCs w:val="24"/>
           </w:rPr>
-          <m:t>= 0,093*0,25 = 0,023</m:t>
+          <m:t>= 0,09</m:t>
+        </m:r>
+        <m:r>
+          <w:rPr>
+            <w:rFonts w:ascii="Cambria Math" w:hAnsi="Cambria Math" w:cs="Times New Roman"/>
+            <w:sz w:val="24"/>
+            <w:szCs w:val="24"/>
+          </w:rPr>
+          <m:t>5</m:t>
+        </m:r>
+        <m:r>
+          <w:rPr>
+            <w:rFonts w:ascii="Cambria Math" w:hAnsi="Cambria Math" w:cs="Times New Roman"/>
+            <w:sz w:val="24"/>
+            <w:szCs w:val="24"/>
+          </w:rPr>
+          <m:t>*0,25 = 0,02</m:t>
+        </m:r>
+        <m:r>
+          <w:rPr>
+            <w:rFonts w:ascii="Cambria Math" w:hAnsi="Cambria Math" w:cs="Times New Roman"/>
+            <w:sz w:val="24"/>
+            <w:szCs w:val="24"/>
+          </w:rPr>
+          <m:t>4</m:t>
         </m:r>
       </m:oMath>
       <w:r>
@@ -21404,7 +21699,55 @@
             <w:sz w:val="24"/>
             <w:szCs w:val="24"/>
           </w:rPr>
-          <m:t xml:space="preserve">=0,120 + 0,03=0,150 </m:t>
+          <m:t>=0,1</m:t>
+        </m:r>
+        <m:r>
+          <w:rPr>
+            <w:rFonts w:ascii="Cambria Math" w:hAnsi="Cambria Math" w:cs="Times New Roman"/>
+            <w:sz w:val="24"/>
+            <w:szCs w:val="24"/>
+          </w:rPr>
+          <m:t>52</m:t>
+        </m:r>
+        <m:r>
+          <w:rPr>
+            <w:rFonts w:ascii="Cambria Math" w:hAnsi="Cambria Math" w:cs="Times New Roman"/>
+            <w:sz w:val="24"/>
+            <w:szCs w:val="24"/>
+          </w:rPr>
+          <m:t xml:space="preserve"> + 0,03</m:t>
+        </m:r>
+        <m:r>
+          <w:rPr>
+            <w:rFonts w:ascii="Cambria Math" w:hAnsi="Cambria Math" w:cs="Times New Roman"/>
+            <w:sz w:val="24"/>
+            <w:szCs w:val="24"/>
+          </w:rPr>
+          <m:t>8</m:t>
+        </m:r>
+        <m:r>
+          <w:rPr>
+            <w:rFonts w:ascii="Cambria Math" w:hAnsi="Cambria Math" w:cs="Times New Roman"/>
+            <w:sz w:val="24"/>
+            <w:szCs w:val="24"/>
+          </w:rPr>
+          <m:t>=0,1</m:t>
+        </m:r>
+        <m:r>
+          <w:rPr>
+            <w:rFonts w:ascii="Cambria Math" w:hAnsi="Cambria Math" w:cs="Times New Roman"/>
+            <w:sz w:val="24"/>
+            <w:szCs w:val="24"/>
+          </w:rPr>
+          <m:t>9</m:t>
+        </m:r>
+        <m:r>
+          <w:rPr>
+            <w:rFonts w:ascii="Cambria Math" w:hAnsi="Cambria Math" w:cs="Times New Roman"/>
+            <w:sz w:val="24"/>
+            <w:szCs w:val="24"/>
+          </w:rPr>
+          <m:t xml:space="preserve">0 </m:t>
         </m:r>
       </m:oMath>
       <w:r>
@@ -21542,7 +21885,55 @@
             <w:sz w:val="24"/>
             <w:szCs w:val="24"/>
           </w:rPr>
-          <m:t xml:space="preserve">=0,093+ 0,023=0,116 </m:t>
+          <m:t>=0,09</m:t>
+        </m:r>
+        <m:r>
+          <w:rPr>
+            <w:rFonts w:ascii="Cambria Math" w:hAnsi="Cambria Math" w:cs="Times New Roman"/>
+            <w:sz w:val="24"/>
+            <w:szCs w:val="24"/>
+          </w:rPr>
+          <m:t>5</m:t>
+        </m:r>
+        <m:r>
+          <w:rPr>
+            <w:rFonts w:ascii="Cambria Math" w:hAnsi="Cambria Math" w:cs="Times New Roman"/>
+            <w:sz w:val="24"/>
+            <w:szCs w:val="24"/>
+          </w:rPr>
+          <m:t>+ 0,02</m:t>
+        </m:r>
+        <m:r>
+          <w:rPr>
+            <w:rFonts w:ascii="Cambria Math" w:hAnsi="Cambria Math" w:cs="Times New Roman"/>
+            <w:sz w:val="24"/>
+            <w:szCs w:val="24"/>
+          </w:rPr>
+          <m:t>4</m:t>
+        </m:r>
+        <m:r>
+          <w:rPr>
+            <w:rFonts w:ascii="Cambria Math" w:hAnsi="Cambria Math" w:cs="Times New Roman"/>
+            <w:sz w:val="24"/>
+            <w:szCs w:val="24"/>
+          </w:rPr>
+          <m:t>=</m:t>
+        </m:r>
+        <m:r>
+          <w:rPr>
+            <w:rFonts w:ascii="Cambria Math" w:hAnsi="Cambria Math" w:cs="Times New Roman"/>
+            <w:sz w:val="24"/>
+            <w:szCs w:val="24"/>
+          </w:rPr>
+          <m:t>0,119</m:t>
+        </m:r>
+        <m:r>
+          <w:rPr>
+            <w:rFonts w:ascii="Cambria Math" w:hAnsi="Cambria Math" w:cs="Times New Roman"/>
+            <w:sz w:val="24"/>
+            <w:szCs w:val="24"/>
+          </w:rPr>
+          <m:t xml:space="preserve"> </m:t>
         </m:r>
       </m:oMath>
       <w:r>
@@ -21894,6 +22285,36 @@
             </m:r>
           </m:sub>
         </m:sSub>
+        <m:r>
+          <w:rPr>
+            <w:rFonts w:ascii="Cambria Math" w:eastAsiaTheme="minorEastAsia" w:hAnsi="Cambria Math" w:cs="Times New Roman"/>
+            <w:sz w:val="24"/>
+            <w:szCs w:val="24"/>
+          </w:rPr>
+          <m:t>=</m:t>
+        </m:r>
+        <m:r>
+          <m:rPr>
+            <m:sty m:val="p"/>
+          </m:rPr>
+          <w:rPr>
+            <w:rFonts w:ascii="Cambria Math" w:hAnsi="Cambria Math" w:cs="Times New Roman"/>
+            <w:sz w:val="24"/>
+            <w:szCs w:val="24"/>
+          </w:rPr>
+          <m:t xml:space="preserve">21785,5 </m:t>
+        </m:r>
+        <m:r>
+          <m:rPr>
+            <m:sty m:val="p"/>
+          </m:rPr>
+          <w:rPr>
+            <w:rFonts w:ascii="Cambria Math" w:hAnsi="Cambria Math" w:cs="Times New Roman"/>
+            <w:sz w:val="24"/>
+            <w:szCs w:val="24"/>
+          </w:rPr>
+          <m:t xml:space="preserve"> кг</m:t>
+        </m:r>
       </m:oMath>
     </w:p>
     <w:p>
@@ -22084,7 +22505,6 @@
           <w:sz w:val="24"/>
           <w:szCs w:val="24"/>
         </w:rPr>
-        <w:lastRenderedPageBreak/>
         <w:t xml:space="preserve">Масса окислителя </w:t>
       </w:r>
       <m:oMath>
@@ -22249,7 +22669,42 @@
             <w:sz w:val="24"/>
             <w:szCs w:val="24"/>
           </w:rPr>
-          <m:t xml:space="preserve"> *25014,91 = 18627,85 </m:t>
+          <m:t xml:space="preserve"> *</m:t>
+        </m:r>
+        <m:r>
+          <m:rPr>
+            <m:sty m:val="p"/>
+          </m:rPr>
+          <w:rPr>
+            <w:rFonts w:ascii="Cambria Math" w:hAnsi="Cambria Math" w:cs="Times New Roman"/>
+            <w:sz w:val="24"/>
+            <w:szCs w:val="24"/>
+          </w:rPr>
+          <m:t>21785,5</m:t>
+        </m:r>
+        <m:r>
+          <w:rPr>
+            <w:rFonts w:ascii="Cambria Math" w:hAnsi="Cambria Math" w:cs="Times New Roman"/>
+            <w:sz w:val="24"/>
+            <w:szCs w:val="24"/>
+          </w:rPr>
+          <m:t xml:space="preserve"> = </m:t>
+        </m:r>
+        <m:r>
+          <w:rPr>
+            <w:rFonts w:ascii="Cambria Math" w:hAnsi="Cambria Math" w:cs="Times New Roman"/>
+            <w:sz w:val="24"/>
+            <w:szCs w:val="24"/>
+          </w:rPr>
+          <m:t>16223</m:t>
+        </m:r>
+        <m:r>
+          <w:rPr>
+            <w:rFonts w:ascii="Cambria Math" w:hAnsi="Cambria Math" w:cs="Times New Roman"/>
+            <w:sz w:val="24"/>
+            <w:szCs w:val="24"/>
+          </w:rPr>
+          <m:t xml:space="preserve"> </m:t>
         </m:r>
       </m:oMath>
       <w:r>
@@ -22276,6 +22731,7 @@
           <w:sz w:val="24"/>
           <w:szCs w:val="24"/>
         </w:rPr>
+        <w:lastRenderedPageBreak/>
         <w:t xml:space="preserve">Масса горючего </w:t>
       </w:r>
       <m:oMath>
@@ -22440,7 +22896,50 @@
             <w:sz w:val="24"/>
             <w:szCs w:val="24"/>
           </w:rPr>
-          <m:t xml:space="preserve"> *25014,91=6387,05 </m:t>
+          <m:t xml:space="preserve"> *</m:t>
+        </m:r>
+        <m:r>
+          <m:rPr>
+            <m:sty m:val="p"/>
+          </m:rPr>
+          <w:rPr>
+            <w:rFonts w:ascii="Cambria Math" w:hAnsi="Cambria Math" w:cs="Times New Roman"/>
+            <w:sz w:val="24"/>
+            <w:szCs w:val="24"/>
+          </w:rPr>
+          <m:t>21785,5</m:t>
+        </m:r>
+        <m:r>
+          <w:rPr>
+            <w:rFonts w:ascii="Cambria Math" w:hAnsi="Cambria Math" w:cs="Times New Roman"/>
+            <w:sz w:val="24"/>
+            <w:szCs w:val="24"/>
+          </w:rPr>
+          <m:t xml:space="preserve"> </m:t>
+        </m:r>
+        <m:r>
+          <w:rPr>
+            <w:rFonts w:ascii="Cambria Math" w:hAnsi="Cambria Math" w:cs="Times New Roman"/>
+            <w:sz w:val="24"/>
+            <w:szCs w:val="24"/>
+          </w:rPr>
+          <m:t>=</m:t>
+        </m:r>
+        <m:r>
+          <w:rPr>
+            <w:rFonts w:ascii="Cambria Math" w:hAnsi="Cambria Math" w:cs="Times New Roman"/>
+            <w:sz w:val="24"/>
+            <w:szCs w:val="24"/>
+          </w:rPr>
+          <m:t>5 562,49</m:t>
+        </m:r>
+        <m:r>
+          <w:rPr>
+            <w:rFonts w:ascii="Cambria Math" w:hAnsi="Cambria Math" w:cs="Times New Roman"/>
+            <w:sz w:val="24"/>
+            <w:szCs w:val="24"/>
+          </w:rPr>
+          <m:t xml:space="preserve"> </m:t>
         </m:r>
       </m:oMath>
       <w:r>
@@ -22625,7 +23124,15 @@
                 <w:sz w:val="24"/>
                 <w:szCs w:val="24"/>
               </w:rPr>
-              <m:t xml:space="preserve">18627,85 </m:t>
+              <m:t>16223</m:t>
+            </m:r>
+            <m:r>
+              <w:rPr>
+                <w:rFonts w:ascii="Cambria Math" w:hAnsi="Cambria Math" w:cs="Times New Roman"/>
+                <w:sz w:val="24"/>
+                <w:szCs w:val="24"/>
+              </w:rPr>
+              <m:t xml:space="preserve"> </m:t>
             </m:r>
             <m:r>
               <m:rPr>
@@ -22656,7 +23163,23 @@
             <w:sz w:val="24"/>
             <w:szCs w:val="24"/>
           </w:rPr>
-          <m:t xml:space="preserve"> = 12,93</m:t>
+          <m:t xml:space="preserve"> = </m:t>
+        </m:r>
+        <m:r>
+          <w:rPr>
+            <w:rFonts w:ascii="Cambria Math" w:hAnsi="Cambria Math" w:cs="Times New Roman"/>
+            <w:sz w:val="24"/>
+            <w:szCs w:val="24"/>
+          </w:rPr>
+          <m:t>11,2</m:t>
+        </m:r>
+        <m:r>
+          <w:rPr>
+            <w:rFonts w:ascii="Cambria Math" w:hAnsi="Cambria Math" w:cs="Times New Roman"/>
+            <w:sz w:val="24"/>
+            <w:szCs w:val="24"/>
+          </w:rPr>
+          <m:t>7</m:t>
         </m:r>
       </m:oMath>
       <w:r>
@@ -22857,7 +23380,7 @@
                 <w:sz w:val="24"/>
                 <w:szCs w:val="24"/>
               </w:rPr>
-              <m:t>6387,05</m:t>
+              <m:t>5 562,49</m:t>
             </m:r>
           </m:num>
           <m:den>
@@ -22877,7 +23400,15 @@
             <w:sz w:val="24"/>
             <w:szCs w:val="24"/>
           </w:rPr>
-          <m:t xml:space="preserve"> =8,08</m:t>
+          <m:t xml:space="preserve"> =</m:t>
+        </m:r>
+        <m:r>
+          <w:rPr>
+            <w:rFonts w:ascii="Cambria Math" w:hAnsi="Cambria Math" w:cs="Times New Roman"/>
+            <w:sz w:val="24"/>
+            <w:szCs w:val="24"/>
+          </w:rPr>
+          <m:t>7,04</m:t>
         </m:r>
       </m:oMath>
       <w:r>
@@ -23281,7 +23812,7 @@
           <w:sz w:val="24"/>
           <w:szCs w:val="24"/>
         </w:rPr>
-        <w:t>13,83</w:t>
+        <w:t>12,0</w:t>
       </w:r>
       <w:r>
         <w:rPr>
@@ -23289,7 +23820,7 @@
           <w:sz w:val="24"/>
           <w:szCs w:val="24"/>
         </w:rPr>
-        <w:t xml:space="preserve"> </w:t>
+        <w:t xml:space="preserve">6 </w:t>
       </w:r>
       <w:r>
         <w:rPr>
@@ -23684,7 +24215,7 @@
           <w:sz w:val="24"/>
           <w:szCs w:val="24"/>
         </w:rPr>
-        <w:t>8,64</w:t>
+        <w:t>7,53</w:t>
       </w:r>
       <w:r>
         <w:rPr>
@@ -24578,7 +25109,23 @@
             <w:sz w:val="24"/>
             <w:szCs w:val="24"/>
           </w:rPr>
-          <m:t>=12,83</m:t>
+          <m:t>=</m:t>
+        </m:r>
+        <m:r>
+          <w:rPr>
+            <w:rFonts w:ascii="Cambria Math" w:hAnsi="Cambria Math" w:cs="Times New Roman"/>
+            <w:sz w:val="24"/>
+            <w:szCs w:val="24"/>
+          </w:rPr>
+          <m:t>11,06</m:t>
+        </m:r>
+        <m:r>
+          <w:rPr>
+            <w:rFonts w:ascii="Cambria Math" w:hAnsi="Cambria Math" w:cs="Times New Roman"/>
+            <w:sz w:val="24"/>
+            <w:szCs w:val="24"/>
+          </w:rPr>
+          <m:t xml:space="preserve"> </m:t>
         </m:r>
       </m:oMath>
       <w:r>
@@ -24778,7 +25325,31 @@
             <w:sz w:val="24"/>
             <w:szCs w:val="24"/>
           </w:rPr>
-          <m:t xml:space="preserve"> = 5,042 </m:t>
+          <m:t xml:space="preserve"> = </m:t>
+        </m:r>
+        <m:r>
+          <w:rPr>
+            <w:rFonts w:ascii="Cambria Math" w:hAnsi="Cambria Math" w:cs="Times New Roman"/>
+            <w:sz w:val="24"/>
+            <w:szCs w:val="24"/>
+          </w:rPr>
+          <m:t>4,3</m:t>
+        </m:r>
+        <m:r>
+          <w:rPr>
+            <w:rFonts w:ascii="Cambria Math" w:hAnsi="Cambria Math" w:cs="Times New Roman"/>
+            <w:sz w:val="24"/>
+            <w:szCs w:val="24"/>
+          </w:rPr>
+          <m:t>5</m:t>
+        </m:r>
+        <m:r>
+          <w:rPr>
+            <w:rFonts w:ascii="Cambria Math" w:hAnsi="Cambria Math" w:cs="Times New Roman"/>
+            <w:sz w:val="24"/>
+            <w:szCs w:val="24"/>
+          </w:rPr>
+          <m:t xml:space="preserve"> </m:t>
         </m:r>
       </m:oMath>
       <w:r>
@@ -24945,7 +25516,31 @@
             <w:sz w:val="24"/>
             <w:szCs w:val="24"/>
           </w:rPr>
-          <m:t xml:space="preserve"> =5,762</m:t>
+          <m:t xml:space="preserve"> =5,</m:t>
+        </m:r>
+        <m:r>
+          <w:rPr>
+            <w:rFonts w:ascii="Cambria Math" w:hAnsi="Cambria Math" w:cs="Times New Roman"/>
+            <w:sz w:val="24"/>
+            <w:szCs w:val="24"/>
+          </w:rPr>
+          <m:t>0</m:t>
+        </m:r>
+        <m:r>
+          <w:rPr>
+            <w:rFonts w:ascii="Cambria Math" w:hAnsi="Cambria Math" w:cs="Times New Roman"/>
+            <w:sz w:val="24"/>
+            <w:szCs w:val="24"/>
+          </w:rPr>
+          <m:t>7</m:t>
+        </m:r>
+        <m:r>
+          <w:rPr>
+            <w:rFonts w:ascii="Cambria Math" w:hAnsi="Cambria Math" w:cs="Times New Roman"/>
+            <w:sz w:val="24"/>
+            <w:szCs w:val="24"/>
+          </w:rPr>
+          <m:t xml:space="preserve"> </m:t>
         </m:r>
       </m:oMath>
       <w:r>
@@ -25071,7 +25666,29 @@
             <w:sz w:val="24"/>
             <w:szCs w:val="24"/>
           </w:rPr>
-          <m:t>= 8,64</m:t>
+          <m:t xml:space="preserve">= </m:t>
+        </m:r>
+        <m:r>
+          <m:rPr>
+            <m:sty m:val="p"/>
+          </m:rPr>
+          <w:rPr>
+            <w:rFonts w:ascii="Cambria Math" w:hAnsi="Cambria Math" w:cs="Times New Roman"/>
+            <w:sz w:val="24"/>
+            <w:szCs w:val="24"/>
+          </w:rPr>
+          <m:t>7,53</m:t>
+        </m:r>
+        <m:r>
+          <m:rPr>
+            <m:sty m:val="p"/>
+          </m:rPr>
+          <w:rPr>
+            <w:rFonts w:ascii="Cambria Math" w:hAnsi="Cambria Math" w:cs="Times New Roman"/>
+            <w:sz w:val="24"/>
+            <w:szCs w:val="24"/>
+          </w:rPr>
+          <m:t xml:space="preserve"> </m:t>
         </m:r>
       </m:oMath>
       <w:r>
@@ -25270,7 +25887,31 @@
             <w:sz w:val="24"/>
             <w:szCs w:val="24"/>
           </w:rPr>
-          <m:t xml:space="preserve"> = 3,395 </m:t>
+          <m:t xml:space="preserve"> = </m:t>
+        </m:r>
+        <m:r>
+          <w:rPr>
+            <w:rFonts w:ascii="Cambria Math" w:hAnsi="Cambria Math" w:cs="Times New Roman"/>
+            <w:sz w:val="24"/>
+            <w:szCs w:val="24"/>
+          </w:rPr>
+          <m:t>2,9</m:t>
+        </m:r>
+        <m:r>
+          <w:rPr>
+            <w:rFonts w:ascii="Cambria Math" w:hAnsi="Cambria Math" w:cs="Times New Roman"/>
+            <w:sz w:val="24"/>
+            <w:szCs w:val="24"/>
+          </w:rPr>
+          <m:t>6</m:t>
+        </m:r>
+        <m:r>
+          <w:rPr>
+            <w:rFonts w:ascii="Cambria Math" w:hAnsi="Cambria Math" w:cs="Times New Roman"/>
+            <w:sz w:val="24"/>
+            <w:szCs w:val="24"/>
+          </w:rPr>
+          <m:t xml:space="preserve"> </m:t>
         </m:r>
       </m:oMath>
       <w:r>
@@ -25426,7 +26067,23 @@
             <w:sz w:val="24"/>
             <w:szCs w:val="24"/>
           </w:rPr>
-          <m:t xml:space="preserve"> = 3,755  </m:t>
+          <m:t xml:space="preserve"> = </m:t>
+        </m:r>
+        <m:r>
+          <w:rPr>
+            <w:rFonts w:ascii="Cambria Math" w:hAnsi="Cambria Math" w:cs="Times New Roman"/>
+            <w:sz w:val="24"/>
+            <w:szCs w:val="24"/>
+          </w:rPr>
+          <m:t>3,3</m:t>
+        </m:r>
+        <m:r>
+          <w:rPr>
+            <w:rFonts w:ascii="Cambria Math" w:hAnsi="Cambria Math" w:cs="Times New Roman"/>
+            <w:sz w:val="24"/>
+            <w:szCs w:val="24"/>
+          </w:rPr>
+          <m:t xml:space="preserve">2 </m:t>
         </m:r>
       </m:oMath>
       <w:r>
@@ -25491,17 +26148,33 @@
             <w:sz w:val="24"/>
             <w:szCs w:val="24"/>
           </w:rPr>
-          <m:t xml:space="preserve"> =  109,4</m:t>
+          <m:t xml:space="preserve"> =  </m:t>
+        </m:r>
+        <m:r>
+          <m:rPr>
+            <m:sty m:val="p"/>
+          </m:rPr>
+          <w:rPr>
+            <w:rFonts w:ascii="Cambria Math" w:hAnsi="Cambria Math"/>
+            <w:sz w:val="24"/>
+            <w:szCs w:val="24"/>
+            <w:lang w:eastAsia="zh-CN"/>
+          </w:rPr>
+          <m:t>107,6</m:t>
+        </m:r>
+        <m:r>
+          <m:rPr>
+            <m:sty m:val="p"/>
+          </m:rPr>
+          <w:rPr>
+            <w:rFonts w:ascii="Cambria Math" w:hAnsi="Times New Roman"/>
+            <w:sz w:val="24"/>
+            <w:szCs w:val="24"/>
+            <w:lang w:eastAsia="zh-CN"/>
+          </w:rPr>
+          <m:t xml:space="preserve"> </m:t>
         </m:r>
       </m:oMath>
-      <w:r>
-        <w:rPr>
-          <w:rFonts w:ascii="Calibri" w:hAnsi="Cambria Math" w:cs="Courier New"/>
-          <w:sz w:val="24"/>
-          <w:szCs w:val="24"/>
-        </w:rPr>
-        <w:t xml:space="preserve"> </w:t>
-      </w:r>
       <w:r>
         <w:rPr>
           <w:rFonts w:ascii="Calibri" w:hAnsi="Cambria Math" w:cs="Courier New"/>
@@ -25679,22 +26352,39 @@
           </m:fPr>
           <m:num>
             <m:r>
-              <w:rPr>
-                <w:rFonts w:ascii="Cambria Math" w:hAnsi="Cambria Math" w:cs="Times New Roman"/>
-                <w:sz w:val="24"/>
-                <w:szCs w:val="24"/>
-              </w:rPr>
-              <m:t>18627,85</m:t>
+              <m:rPr>
+                <m:sty m:val="p"/>
+              </m:rPr>
+              <w:rPr>
+                <w:rFonts w:ascii="Cambria Math" w:hAnsi="Cambria Math" w:cs="Times New Roman"/>
+              </w:rPr>
+              <m:t xml:space="preserve">26928,9 </m:t>
             </m:r>
           </m:num>
           <m:den>
             <m:r>
-              <w:rPr>
-                <w:rFonts w:ascii="Cambria Math" w:hAnsi="Cambria Math" w:cs="Times New Roman"/>
-                <w:sz w:val="24"/>
-                <w:szCs w:val="24"/>
-              </w:rPr>
-              <m:t>109,4</m:t>
+              <m:rPr>
+                <m:sty m:val="p"/>
+              </m:rPr>
+              <w:rPr>
+                <w:rFonts w:ascii="Cambria Math" w:hAnsi="Cambria Math"/>
+                <w:sz w:val="24"/>
+                <w:szCs w:val="24"/>
+                <w:lang w:eastAsia="zh-CN"/>
+              </w:rPr>
+              <m:t>107,6</m:t>
+            </m:r>
+            <m:r>
+              <m:rPr>
+                <m:sty m:val="p"/>
+              </m:rPr>
+              <w:rPr>
+                <w:rFonts w:ascii="Cambria Math" w:hAnsi="Times New Roman"/>
+                <w:sz w:val="24"/>
+                <w:szCs w:val="24"/>
+                <w:lang w:eastAsia="zh-CN"/>
+              </w:rPr>
+              <m:t xml:space="preserve"> </m:t>
             </m:r>
           </m:den>
         </m:f>
@@ -25704,7 +26394,23 @@
             <w:sz w:val="24"/>
             <w:szCs w:val="24"/>
           </w:rPr>
-          <m:t xml:space="preserve"> = 170,27</m:t>
+          <m:t xml:space="preserve"> = </m:t>
+        </m:r>
+        <m:r>
+          <w:rPr>
+            <w:rFonts w:ascii="Cambria Math" w:hAnsi="Cambria Math" w:cs="Times New Roman"/>
+            <w:sz w:val="24"/>
+            <w:szCs w:val="24"/>
+          </w:rPr>
+          <m:t>250</m:t>
+        </m:r>
+        <m:r>
+          <w:rPr>
+            <w:rFonts w:ascii="Cambria Math" w:hAnsi="Cambria Math" w:cs="Times New Roman"/>
+            <w:sz w:val="24"/>
+            <w:szCs w:val="24"/>
+          </w:rPr>
+          <m:t>,27</m:t>
         </m:r>
       </m:oMath>
       <w:r>
@@ -25731,7 +26437,6 @@
         </w:rPr>
         <w:t>/</w:t>
       </w:r>
-      <w:proofErr w:type="gramStart"/>
       <w:r>
         <w:rPr>
           <w:rFonts w:ascii="Calibri" w:hAnsi="Cambria Math" w:cs="Times New Roman"/>
@@ -25746,9 +26451,16 @@
           <w:sz w:val="24"/>
           <w:szCs w:val="24"/>
         </w:rPr>
-        <w:t xml:space="preserve">,   </w:t>
-      </w:r>
-      <w:proofErr w:type="gramEnd"/>
+        <w:t>,</w:t>
+      </w:r>
+      <w:r>
+        <w:rPr>
+          <w:rFonts w:ascii="Calibri" w:hAnsi="Cambria Math" w:cs="Times New Roman"/>
+          <w:sz w:val="24"/>
+          <w:szCs w:val="24"/>
+        </w:rPr>
+        <w:t xml:space="preserve"> </w:t>
+      </w:r>
       <w:r>
         <w:rPr>
           <w:rFonts w:ascii="Calibri" w:hAnsi="Cambria Math" w:cs="Times New Roman"/>
@@ -25921,7 +26633,15 @@
                 <w:sz w:val="24"/>
                 <w:szCs w:val="24"/>
               </w:rPr>
-              <m:t>6387,05</m:t>
+              <m:t>5562,49</m:t>
+            </m:r>
+            <m:r>
+              <w:rPr>
+                <w:rFonts w:ascii="Cambria Math" w:hAnsi="Cambria Math" w:cs="Times New Roman"/>
+                <w:sz w:val="24"/>
+                <w:szCs w:val="24"/>
+              </w:rPr>
+              <m:t xml:space="preserve"> </m:t>
             </m:r>
           </m:num>
           <m:den>
@@ -25930,11 +26650,24 @@
                 <m:sty m:val="p"/>
               </m:rPr>
               <w:rPr>
-                <w:rFonts w:ascii="Cambria Math" w:hAnsi="Cambria Math" w:cs="Courier New"/>
-                <w:sz w:val="24"/>
-                <w:szCs w:val="24"/>
-              </w:rPr>
-              <m:t>109,4</m:t>
+                <w:rFonts w:ascii="Cambria Math" w:hAnsi="Cambria Math"/>
+                <w:sz w:val="24"/>
+                <w:szCs w:val="24"/>
+                <w:lang w:eastAsia="zh-CN"/>
+              </w:rPr>
+              <m:t>107,6</m:t>
+            </m:r>
+            <m:r>
+              <m:rPr>
+                <m:sty m:val="p"/>
+              </m:rPr>
+              <w:rPr>
+                <w:rFonts w:ascii="Cambria Math" w:hAnsi="Times New Roman"/>
+                <w:sz w:val="24"/>
+                <w:szCs w:val="24"/>
+                <w:lang w:eastAsia="zh-CN"/>
+              </w:rPr>
+              <m:t xml:space="preserve"> </m:t>
             </m:r>
           </m:den>
         </m:f>
@@ -25944,7 +26677,31 @@
             <w:sz w:val="24"/>
             <w:szCs w:val="24"/>
           </w:rPr>
-          <m:t xml:space="preserve"> = 58,38</m:t>
+          <m:t xml:space="preserve"> = 5</m:t>
+        </m:r>
+        <m:r>
+          <w:rPr>
+            <w:rFonts w:ascii="Cambria Math" w:hAnsi="Cambria Math" w:cs="Times New Roman"/>
+            <w:sz w:val="24"/>
+            <w:szCs w:val="24"/>
+          </w:rPr>
+          <m:t>1</m:t>
+        </m:r>
+        <m:r>
+          <w:rPr>
+            <w:rFonts w:ascii="Cambria Math" w:hAnsi="Cambria Math" w:cs="Times New Roman"/>
+            <w:sz w:val="24"/>
+            <w:szCs w:val="24"/>
+          </w:rPr>
+          <m:t>,</m:t>
+        </m:r>
+        <m:r>
+          <w:rPr>
+            <w:rFonts w:ascii="Cambria Math" w:hAnsi="Cambria Math" w:cs="Times New Roman"/>
+            <w:sz w:val="24"/>
+            <w:szCs w:val="24"/>
+          </w:rPr>
+          <m:t>70</m:t>
         </m:r>
       </m:oMath>
       <w:r>
@@ -26198,7 +26955,18 @@
                     <w:sz w:val="24"/>
                     <w:szCs w:val="24"/>
                   </w:rPr>
-                  <m:t>170,27</m:t>
+                  <m:t>250,27</m:t>
+                </m:r>
+                <m:r>
+                  <m:rPr>
+                    <m:sty m:val="p"/>
+                  </m:rPr>
+                  <w:rPr>
+                    <w:rFonts w:ascii="Cambria Math" w:hAnsi="Cambria Math" w:cs="Times New Roman"/>
+                    <w:sz w:val="24"/>
+                    <w:szCs w:val="24"/>
+                  </w:rPr>
+                  <m:t xml:space="preserve"> </m:t>
                 </m:r>
               </m:num>
               <m:den>
@@ -26220,7 +26988,15 @@
             <w:sz w:val="24"/>
             <w:szCs w:val="24"/>
           </w:rPr>
-          <m:t xml:space="preserve">  = 0,064</m:t>
+          <m:t xml:space="preserve">  = 0,0</m:t>
+        </m:r>
+        <m:r>
+          <w:rPr>
+            <w:rFonts w:ascii="Cambria Math" w:hAnsi="Cambria Math" w:cs="Times New Roman"/>
+            <w:sz w:val="24"/>
+            <w:szCs w:val="24"/>
+          </w:rPr>
+          <m:t>78</m:t>
         </m:r>
       </m:oMath>
       <w:r>
@@ -26249,14 +27025,6 @@
         <w:t xml:space="preserve">,   </w:t>
       </w:r>
       <w:proofErr w:type="gramEnd"/>
-      <w:r>
-        <w:rPr>
-          <w:rFonts w:ascii="Calibri" w:hAnsi="Cambria Math" w:cs="Times New Roman"/>
-          <w:sz w:val="24"/>
-          <w:szCs w:val="24"/>
-        </w:rPr>
-        <w:t xml:space="preserve">  </w:t>
-      </w:r>
       <m:oMath>
         <m:sSub>
           <m:sSubPr>
@@ -26481,7 +27249,7 @@
                     <w:sz w:val="24"/>
                     <w:szCs w:val="24"/>
                   </w:rPr>
-                  <m:t>58,38</m:t>
+                  <m:t>51,70</m:t>
                 </m:r>
               </m:num>
               <m:den>
@@ -26503,7 +27271,23 @@
             <w:sz w:val="24"/>
             <w:szCs w:val="24"/>
           </w:rPr>
-          <m:t xml:space="preserve">  = 0,057 </m:t>
+          <m:t xml:space="preserve">  = 0,05</m:t>
+        </m:r>
+        <m:r>
+          <w:rPr>
+            <w:rFonts w:ascii="Cambria Math" w:hAnsi="Cambria Math" w:cs="Times New Roman"/>
+            <w:sz w:val="24"/>
+            <w:szCs w:val="24"/>
+          </w:rPr>
+          <m:t>4</m:t>
+        </m:r>
+        <m:r>
+          <w:rPr>
+            <w:rFonts w:ascii="Cambria Math" w:hAnsi="Cambria Math" w:cs="Times New Roman"/>
+            <w:sz w:val="24"/>
+            <w:szCs w:val="24"/>
+          </w:rPr>
+          <m:t xml:space="preserve"> </m:t>
         </m:r>
       </m:oMath>
       <w:r>
@@ -26572,7 +27356,31 @@
             <w:sz w:val="24"/>
             <w:szCs w:val="24"/>
           </w:rPr>
-          <m:t>= 0,064*0,25 = 0,0</m:t>
+          <m:t>= 0,0</m:t>
+        </m:r>
+        <m:r>
+          <w:rPr>
+            <w:rFonts w:ascii="Cambria Math" w:hAnsi="Cambria Math" w:cs="Times New Roman"/>
+            <w:sz w:val="24"/>
+            <w:szCs w:val="24"/>
+          </w:rPr>
+          <m:t>78</m:t>
+        </m:r>
+        <m:r>
+          <w:rPr>
+            <w:rFonts w:ascii="Cambria Math" w:hAnsi="Cambria Math" w:cs="Times New Roman"/>
+            <w:sz w:val="24"/>
+            <w:szCs w:val="24"/>
+          </w:rPr>
+          <m:t xml:space="preserve">*0,25 = </m:t>
+        </m:r>
+        <m:r>
+          <w:rPr>
+            <w:rFonts w:ascii="Cambria Math" w:hAnsi="Cambria Math" w:cs="Times New Roman"/>
+            <w:sz w:val="24"/>
+            <w:szCs w:val="24"/>
+          </w:rPr>
+          <m:t>0,0195</m:t>
         </m:r>
       </m:oMath>
       <w:r>
@@ -26581,7 +27389,7 @@
           <w:sz w:val="24"/>
           <w:szCs w:val="24"/>
         </w:rPr>
-        <w:t>1</w:t>
+        <w:t xml:space="preserve"> </w:t>
       </w:r>
       <w:r>
         <w:rPr>
@@ -26589,7 +27397,7 @@
           <w:sz w:val="24"/>
           <w:szCs w:val="24"/>
         </w:rPr>
-        <w:t>6</w:t>
+        <w:t>м</w:t>
       </w:r>
       <w:r>
         <w:rPr>
@@ -26597,26 +27405,8 @@
           <w:sz w:val="24"/>
           <w:szCs w:val="24"/>
         </w:rPr>
-        <w:t xml:space="preserve"> </w:t>
-      </w:r>
-      <w:proofErr w:type="gramStart"/>
-      <w:r>
-        <w:rPr>
-          <w:rFonts w:ascii="Calibri" w:hAnsi="Cambria Math" w:cs="Times New Roman"/>
-          <w:sz w:val="24"/>
-          <w:szCs w:val="24"/>
-        </w:rPr>
-        <w:t>м</w:t>
-      </w:r>
-      <w:r>
-        <w:rPr>
-          <w:rFonts w:ascii="Calibri" w:hAnsi="Cambria Math" w:cs="Times New Roman"/>
-          <w:sz w:val="24"/>
-          <w:szCs w:val="24"/>
-        </w:rPr>
-        <w:t xml:space="preserve">,   </w:t>
-      </w:r>
-      <w:proofErr w:type="gramEnd"/>
+        <w:t xml:space="preserve">,  </w:t>
+      </w:r>
       <m:oMath>
         <m:sSub>
           <m:sSubPr>
@@ -26656,7 +27446,23 @@
             <w:sz w:val="24"/>
             <w:szCs w:val="24"/>
           </w:rPr>
-          <m:t>= 0,057*0,25 = 0,0</m:t>
+          <m:t>= 0,0</m:t>
+        </m:r>
+        <m:r>
+          <w:rPr>
+            <w:rFonts w:ascii="Cambria Math" w:hAnsi="Cambria Math" w:cs="Times New Roman"/>
+            <w:sz w:val="24"/>
+            <w:szCs w:val="24"/>
+          </w:rPr>
+          <m:t>4</m:t>
+        </m:r>
+        <m:r>
+          <w:rPr>
+            <w:rFonts w:ascii="Cambria Math" w:hAnsi="Cambria Math" w:cs="Times New Roman"/>
+            <w:sz w:val="24"/>
+            <w:szCs w:val="24"/>
+          </w:rPr>
+          <m:t>*0,25 = 0,0</m:t>
         </m:r>
       </m:oMath>
       <w:r>
@@ -26665,23 +27471,7 @@
           <w:sz w:val="24"/>
           <w:szCs w:val="24"/>
         </w:rPr>
-        <w:t>1</w:t>
-      </w:r>
-      <w:r>
-        <w:rPr>
-          <w:rFonts w:ascii="Calibri" w:hAnsi="Cambria Math" w:cs="Times New Roman"/>
-          <w:sz w:val="24"/>
-          <w:szCs w:val="24"/>
-        </w:rPr>
-        <w:t>4</w:t>
-      </w:r>
-      <w:r>
-        <w:rPr>
-          <w:rFonts w:ascii="Calibri" w:hAnsi="Cambria Math" w:cs="Times New Roman"/>
-          <w:sz w:val="24"/>
-          <w:szCs w:val="24"/>
-        </w:rPr>
-        <w:t xml:space="preserve"> </w:t>
+        <w:t xml:space="preserve">1 </w:t>
       </w:r>
       <w:r>
         <w:rPr>
@@ -26829,25 +27619,60 @@
             <w:sz w:val="24"/>
             <w:szCs w:val="24"/>
           </w:rPr>
-          <m:t>=0,064 + 0,016=0,</m:t>
+          <m:t>=0,0</m:t>
+        </m:r>
+        <m:r>
+          <w:rPr>
+            <w:rFonts w:ascii="Cambria Math" w:hAnsi="Cambria Math" w:cs="Times New Roman"/>
+            <w:sz w:val="24"/>
+            <w:szCs w:val="24"/>
+          </w:rPr>
+          <m:t>78</m:t>
+        </m:r>
+        <m:r>
+          <w:rPr>
+            <w:rFonts w:ascii="Cambria Math" w:hAnsi="Cambria Math" w:cs="Times New Roman"/>
+            <w:sz w:val="24"/>
+            <w:szCs w:val="24"/>
+          </w:rPr>
+          <m:t xml:space="preserve"> + </m:t>
+        </m:r>
+        <m:r>
+          <w:rPr>
+            <w:rFonts w:ascii="Cambria Math" w:hAnsi="Cambria Math" w:cs="Times New Roman"/>
+            <w:sz w:val="24"/>
+            <w:szCs w:val="24"/>
+          </w:rPr>
+          <m:t>0,0195</m:t>
+        </m:r>
+        <m:r>
+          <m:rPr>
+            <m:sty m:val="p"/>
+          </m:rPr>
+          <w:rPr>
+            <w:rFonts w:ascii="Cambria Math" w:hAnsi="Cambria Math" w:cs="Times New Roman"/>
+            <w:sz w:val="24"/>
+            <w:szCs w:val="24"/>
+          </w:rPr>
+          <m:t xml:space="preserve"> </m:t>
+        </m:r>
+        <m:r>
+          <w:rPr>
+            <w:rFonts w:ascii="Cambria Math" w:hAnsi="Cambria Math" w:cs="Times New Roman"/>
+            <w:sz w:val="24"/>
+            <w:szCs w:val="24"/>
+          </w:rPr>
+          <m:t>=</m:t>
+        </m:r>
+        <m:r>
+          <w:rPr>
+            <w:rFonts w:ascii="Cambria Math" w:hAnsi="Cambria Math" w:cs="Times New Roman"/>
+            <w:sz w:val="24"/>
+            <w:szCs w:val="24"/>
+          </w:rPr>
+          <m:t>0,0975</m:t>
         </m:r>
       </m:oMath>
-      <w:r>
-        <w:rPr>
-          <w:rFonts w:ascii="Calibri" w:hAnsi="Cambria Math" w:cs="Times New Roman"/>
-          <w:sz w:val="24"/>
-          <w:szCs w:val="24"/>
-        </w:rPr>
-        <w:t>0</w:t>
-      </w:r>
-      <w:r>
-        <w:rPr>
-          <w:rFonts w:ascii="Calibri" w:hAnsi="Cambria Math" w:cs="Times New Roman"/>
-          <w:sz w:val="24"/>
-          <w:szCs w:val="24"/>
-        </w:rPr>
-        <w:t>80</w:t>
-      </w:r>
       <w:r>
         <w:rPr>
           <w:rFonts w:ascii="Calibri" w:hAnsi="Cambria Math" w:cs="Times New Roman"/>
@@ -27009,7 +27834,23 @@
             <w:sz w:val="24"/>
             <w:szCs w:val="24"/>
           </w:rPr>
-          <m:t>=0,057+ 0,014=0,</m:t>
+          <m:t>=0,05</m:t>
+        </m:r>
+        <m:r>
+          <w:rPr>
+            <w:rFonts w:ascii="Cambria Math" w:hAnsi="Cambria Math" w:cs="Times New Roman"/>
+            <w:sz w:val="24"/>
+            <w:szCs w:val="24"/>
+          </w:rPr>
+          <m:t>4</m:t>
+        </m:r>
+        <m:r>
+          <w:rPr>
+            <w:rFonts w:ascii="Cambria Math" w:hAnsi="Cambria Math" w:cs="Times New Roman"/>
+            <w:sz w:val="24"/>
+            <w:szCs w:val="24"/>
+          </w:rPr>
+          <m:t>+ 0,01=0,</m:t>
         </m:r>
       </m:oMath>
       <w:r>
@@ -27026,7 +27867,7 @@
           <w:sz w:val="24"/>
           <w:szCs w:val="24"/>
         </w:rPr>
-        <w:t>71</w:t>
+        <w:t>64</w:t>
       </w:r>
       <w:r>
         <w:rPr>
@@ -27060,7 +27901,6 @@
           <w:rFonts w:ascii="Times New Roman" w:hAnsi="Times New Roman" w:cs="Times New Roman"/>
           <w:sz w:val="24"/>
           <w:szCs w:val="24"/>
-          <w:lang w:val="en-US"/>
         </w:rPr>
       </w:pPr>
     </w:p>
@@ -27235,7 +28075,6 @@
           <w:sz w:val="24"/>
           <w:szCs w:val="24"/>
         </w:rPr>
-        <w:lastRenderedPageBreak/>
         <w:t xml:space="preserve">Диаметр среза сопла, </w:t>
       </w:r>
       <m:oMath>
@@ -27288,6 +28127,7 @@
           <w:sz w:val="24"/>
           <w:szCs w:val="24"/>
         </w:rPr>
+        <w:lastRenderedPageBreak/>
         <w:t xml:space="preserve">Диаметр камеры сгорания, </w:t>
       </w:r>
       <m:oMath>
@@ -27607,7 +28447,15 @@
             <w:sz w:val="24"/>
             <w:szCs w:val="24"/>
           </w:rPr>
-          <m:t>= 0,166</m:t>
+          <m:t>= 0,16</m:t>
+        </m:r>
+        <m:r>
+          <w:rPr>
+            <w:rFonts w:ascii="Cambria Math" w:hAnsi="Cambria Math" w:cs="Times New Roman"/>
+            <w:sz w:val="24"/>
+            <w:szCs w:val="24"/>
+          </w:rPr>
+          <m:t>28</m:t>
         </m:r>
       </m:oMath>
       <w:r>
@@ -27804,10 +28652,10 @@
           </m:rPr>
           <w:rPr>
             <w:rFonts w:ascii="Cambria Math" w:hAnsi="Cambria Math" w:cs="Arial"/>
-            <w:sz w:val="20"/>
-            <w:szCs w:val="20"/>
+            <w:sz w:val="24"/>
+            <w:szCs w:val="24"/>
           </w:rPr>
-          <m:t xml:space="preserve">0,8127 </m:t>
+          <m:t xml:space="preserve">0,236 </m:t>
         </m:r>
       </m:oMath>
       <w:r>
@@ -27909,7 +28757,23 @@
             <w:sz w:val="24"/>
             <w:szCs w:val="24"/>
           </w:rPr>
-          <m:t xml:space="preserve"> = 0,332</m:t>
+          <m:t xml:space="preserve"> = </m:t>
+        </m:r>
+        <m:r>
+          <w:rPr>
+            <w:rFonts w:ascii="Cambria Math" w:hAnsi="Cambria Math" w:cs="Times New Roman"/>
+            <w:sz w:val="24"/>
+            <w:szCs w:val="24"/>
+          </w:rPr>
+          <m:t>0,3256</m:t>
+        </m:r>
+        <m:r>
+          <w:rPr>
+            <w:rFonts w:ascii="Cambria Math" w:hAnsi="Cambria Math" w:cs="Times New Roman"/>
+            <w:sz w:val="24"/>
+            <w:szCs w:val="24"/>
+          </w:rPr>
+          <m:t xml:space="preserve"> </m:t>
         </m:r>
       </m:oMath>
       <w:r>
@@ -27918,7 +28782,7 @@
           <w:sz w:val="24"/>
           <w:szCs w:val="24"/>
         </w:rPr>
-        <w:t xml:space="preserve"> м</w:t>
+        <w:t>м</w:t>
       </w:r>
       <w:r>
         <w:rPr>
@@ -28169,7 +29033,29 @@
             <w:sz w:val="24"/>
             <w:szCs w:val="24"/>
           </w:rPr>
-          <m:t xml:space="preserve"> = 0,8127</m:t>
+          <m:t xml:space="preserve"> = </m:t>
+        </m:r>
+        <m:r>
+          <m:rPr>
+            <m:sty m:val="p"/>
+          </m:rPr>
+          <w:rPr>
+            <w:rFonts w:ascii="Cambria Math" w:hAnsi="Cambria Math" w:cs="Arial"/>
+            <w:sz w:val="24"/>
+            <w:szCs w:val="24"/>
+          </w:rPr>
+          <m:t>0,236</m:t>
+        </m:r>
+        <m:r>
+          <m:rPr>
+            <m:sty m:val="p"/>
+          </m:rPr>
+          <w:rPr>
+            <w:rFonts w:ascii="Cambria Math" w:hAnsi="Cambria Math" w:cs="Arial"/>
+            <w:sz w:val="24"/>
+            <w:szCs w:val="24"/>
+          </w:rPr>
+          <m:t xml:space="preserve"> </m:t>
         </m:r>
       </m:oMath>
       <w:r>
@@ -28178,7 +29064,7 @@
           <w:sz w:val="24"/>
           <w:szCs w:val="24"/>
         </w:rPr>
-        <w:t xml:space="preserve"> м</w:t>
+        <w:t>м</w:t>
       </w:r>
       <w:r>
         <w:rPr>
@@ -28447,18 +29333,7 @@
             <w:szCs w:val="24"/>
             <w:lang w:eastAsia="zh-CN"/>
           </w:rPr>
-          <m:t>0,</m:t>
-        </m:r>
-        <m:r>
-          <m:rPr>
-            <m:sty m:val="p"/>
-          </m:rPr>
-          <w:rPr>
-            <w:rFonts w:ascii="Cambria Math" w:hAnsi="Cambria Math"/>
-            <w:sz w:val="24"/>
-            <w:szCs w:val="24"/>
-          </w:rPr>
-          <m:t>206</m:t>
+          <m:t>0,1869</m:t>
         </m:r>
         <m:r>
           <m:rPr>
@@ -28604,65 +29479,94 @@
             </m:r>
           </m:sub>
         </m:sSub>
+        <m:rad>
+          <m:radPr>
+            <m:degHide m:val="1"/>
+            <m:ctrlPr>
+              <w:rPr>
+                <w:rFonts w:ascii="Cambria Math" w:hAnsi="Cambria Math" w:cs="Times New Roman"/>
+                <w:i/>
+                <w:sz w:val="24"/>
+                <w:szCs w:val="24"/>
+              </w:rPr>
+            </m:ctrlPr>
+          </m:radPr>
+          <m:deg/>
+          <m:e>
+            <m:sSub>
+              <m:sSubPr>
+                <m:ctrlPr>
+                  <w:rPr>
+                    <w:rFonts w:ascii="Cambria Math" w:hAnsi="Cambria Math" w:cs="Times New Roman"/>
+                    <w:i/>
+                    <w:sz w:val="24"/>
+                    <w:szCs w:val="24"/>
+                  </w:rPr>
+                </m:ctrlPr>
+              </m:sSubPr>
+              <m:e>
+                <m:r>
+                  <w:rPr>
+                    <w:rFonts w:ascii="Cambria Math" w:hAnsi="Cambria Math" w:cs="Times New Roman"/>
+                    <w:sz w:val="24"/>
+                    <w:szCs w:val="24"/>
+                    <w:lang w:val="en-US"/>
+                  </w:rPr>
+                  <m:t>f</m:t>
+                </m:r>
+              </m:e>
+              <m:sub>
+                <m:r>
+                  <w:rPr>
+                    <w:rFonts w:ascii="Cambria Math" w:hAnsi="Cambria Math" w:cs="Times New Roman"/>
+                    <w:sz w:val="24"/>
+                    <w:szCs w:val="24"/>
+                  </w:rPr>
+                  <m:t>а</m:t>
+                </m:r>
+              </m:sub>
+            </m:sSub>
+          </m:e>
+        </m:rad>
         <m:r>
           <w:rPr>
             <w:rFonts w:ascii="Cambria Math" w:hAnsi="Cambria Math" w:cs="Times New Roman"/>
             <w:sz w:val="24"/>
             <w:szCs w:val="24"/>
           </w:rPr>
-          <m:t>√</m:t>
+          <m:t xml:space="preserve"> =</m:t>
         </m:r>
-        <m:sSub>
-          <m:sSubPr>
-            <m:ctrlPr>
-              <w:rPr>
-                <w:rFonts w:ascii="Cambria Math" w:hAnsi="Cambria Math" w:cs="Times New Roman"/>
-                <w:i/>
-                <w:sz w:val="24"/>
-                <w:szCs w:val="24"/>
-              </w:rPr>
-            </m:ctrlPr>
-          </m:sSubPr>
-          <m:e>
-            <m:r>
-              <w:rPr>
-                <w:rFonts w:ascii="Cambria Math" w:hAnsi="Cambria Math" w:cs="Times New Roman"/>
-                <w:sz w:val="24"/>
-                <w:szCs w:val="24"/>
-                <w:lang w:val="en-US"/>
-              </w:rPr>
-              <m:t>f</m:t>
-            </m:r>
-          </m:e>
-          <m:sub>
-            <m:r>
-              <w:rPr>
-                <w:rFonts w:ascii="Cambria Math" w:hAnsi="Cambria Math" w:cs="Times New Roman"/>
-                <w:sz w:val="24"/>
-                <w:szCs w:val="24"/>
-              </w:rPr>
-              <m:t>а</m:t>
-            </m:r>
-          </m:sub>
-        </m:sSub>
         <m:r>
           <w:rPr>
             <w:rFonts w:ascii="Cambria Math" w:hAnsi="Cambria Math" w:cs="Times New Roman"/>
             <w:sz w:val="24"/>
             <w:szCs w:val="24"/>
           </w:rPr>
-          <m:t xml:space="preserve"> = </m:t>
+          <m:t xml:space="preserve"> </m:t>
         </m:r>
         <m:r>
-          <m:rPr>
-            <m:sty m:val="p"/>
-          </m:rPr>
           <w:rPr>
-            <w:rFonts w:ascii="Cambria Math" w:hAnsi="Cambria Math" w:cs="Arial"/>
-            <w:sz w:val="20"/>
-            <w:szCs w:val="20"/>
+            <w:rFonts w:ascii="Cambria Math" w:hAnsi="Cambria Math" w:cs="Times New Roman"/>
+            <w:sz w:val="24"/>
+            <w:szCs w:val="24"/>
           </w:rPr>
-          <m:t>2,0238</m:t>
+          <m:t>0,31</m:t>
+        </m:r>
+        <m:r>
+          <w:rPr>
+            <w:rFonts w:ascii="Cambria Math" w:hAnsi="Cambria Math" w:cs="Times New Roman"/>
+            <w:sz w:val="24"/>
+            <w:szCs w:val="24"/>
+          </w:rPr>
+          <m:t>4</m:t>
+        </m:r>
+        <m:r>
+          <w:rPr>
+            <w:rFonts w:ascii="Cambria Math" w:hAnsi="Cambria Math" w:cs="Times New Roman"/>
+            <w:sz w:val="24"/>
+            <w:szCs w:val="24"/>
+          </w:rPr>
+          <m:t xml:space="preserve"> </m:t>
         </m:r>
       </m:oMath>
       <w:r>
@@ -28671,12 +29575,12 @@
           <w:sz w:val="24"/>
           <w:szCs w:val="24"/>
         </w:rPr>
-        <w:t xml:space="preserve"> м</w:t>
-      </w:r>
-    </w:p>
-    <w:p>
-      <w:pPr>
-        <w:spacing w:after="0" w:line="240" w:lineRule="auto"/>
+        <w:t>м</w:t>
+      </w:r>
+    </w:p>
+    <w:p>
+      <w:pPr>
+        <w:spacing w:after="0" w:line="360" w:lineRule="auto"/>
         <w:rPr>
           <w:rFonts w:ascii="Times New Roman" w:hAnsi="Times New Roman" w:cs="Times New Roman"/>
           <w:sz w:val="24"/>
@@ -28764,7 +29668,15 @@
             <w:sz w:val="24"/>
             <w:szCs w:val="24"/>
           </w:rPr>
-          <m:t xml:space="preserve"> = 0,412</m:t>
+          <m:t xml:space="preserve"> = </m:t>
+        </m:r>
+        <m:r>
+          <w:rPr>
+            <w:rFonts w:ascii="Cambria Math" w:hAnsi="Cambria Math" w:cs="Times New Roman"/>
+            <w:sz w:val="24"/>
+            <w:szCs w:val="24"/>
+          </w:rPr>
+          <m:t>0,542</m:t>
         </m:r>
       </m:oMath>
       <w:r>
@@ -28951,7 +29863,7 @@
     </w:p>
     <w:p>
       <w:pPr>
-        <w:spacing w:after="0" w:line="240" w:lineRule="auto"/>
+        <w:spacing w:after="0" w:line="360" w:lineRule="auto"/>
         <w:rPr>
           <w:rFonts w:ascii="Times New Roman" w:hAnsi="Times New Roman" w:cs="Times New Roman"/>
           <w:sz w:val="24"/>
@@ -29235,7 +30147,7 @@
     </w:p>
     <w:p>
       <w:pPr>
-        <w:spacing w:after="0" w:line="240" w:lineRule="auto"/>
+        <w:spacing w:after="0" w:line="360" w:lineRule="auto"/>
         <w:rPr>
           <w:rFonts w:ascii="Times New Roman" w:hAnsi="Times New Roman" w:cs="Times New Roman"/>
           <w:sz w:val="24"/>
@@ -29253,7 +30165,7 @@
     </w:p>
     <w:p>
       <w:pPr>
-        <w:spacing w:after="0" w:line="240" w:lineRule="auto"/>
+        <w:spacing w:after="0" w:line="360" w:lineRule="auto"/>
         <w:rPr>
           <w:rFonts w:ascii="Times New Roman" w:eastAsiaTheme="minorEastAsia" w:hAnsi="Times New Roman" w:cs="Times New Roman"/>
           <w:sz w:val="24"/>
@@ -29325,10 +30237,18 @@
       <w:r>
         <w:rPr>
           <w:rFonts w:ascii="Arial" w:hAnsi="Arial" w:cs="Arial"/>
-          <w:sz w:val="20"/>
-          <w:szCs w:val="20"/>
-        </w:rPr>
-        <w:t xml:space="preserve">2,406 </w:t>
+          <w:sz w:val="24"/>
+          <w:szCs w:val="24"/>
+        </w:rPr>
+        <w:t>2,484</w:t>
+      </w:r>
+      <w:r>
+        <w:rPr>
+          <w:rFonts w:ascii="Arial" w:hAnsi="Arial" w:cs="Arial"/>
+          <w:sz w:val="24"/>
+          <w:szCs w:val="24"/>
+        </w:rPr>
+        <w:t xml:space="preserve"> </w:t>
       </w:r>
       <w:r>
         <w:rPr>
@@ -29345,13 +30265,6 @@
           <w:szCs w:val="24"/>
         </w:rPr>
         <w:tab/>
-      </w:r>
-      <w:r>
-        <w:rPr>
-          <w:rFonts w:ascii="Times New Roman" w:hAnsi="Times New Roman" w:cs="Times New Roman"/>
-          <w:sz w:val="24"/>
-          <w:szCs w:val="24"/>
-        </w:rPr>
         <w:t xml:space="preserve">Длина БО 1 ст.: </w:t>
       </w:r>
       <m:oMath>
@@ -29394,7 +30307,15 @@
             <w:sz w:val="24"/>
             <w:szCs w:val="24"/>
           </w:rPr>
-          <m:t>= 6,789</m:t>
+          <m:t xml:space="preserve">= </m:t>
+        </m:r>
+        <m:r>
+          <w:rPr>
+            <w:rFonts w:ascii="Cambria Math" w:hAnsi="Cambria Math" w:cs="Times New Roman"/>
+            <w:sz w:val="24"/>
+            <w:szCs w:val="24"/>
+          </w:rPr>
+          <m:t xml:space="preserve">5,038 </m:t>
         </m:r>
       </m:oMath>
       <w:r>
@@ -29454,7 +30375,23 @@
             <w:sz w:val="24"/>
             <w:szCs w:val="24"/>
           </w:rPr>
-          <m:t xml:space="preserve">= 4,405 </m:t>
+          <m:t xml:space="preserve">= </m:t>
+        </m:r>
+        <m:r>
+          <w:rPr>
+            <w:rFonts w:ascii="Cambria Math" w:hAnsi="Cambria Math" w:cs="Times New Roman"/>
+            <w:sz w:val="24"/>
+            <w:szCs w:val="24"/>
+          </w:rPr>
+          <m:t>4,217</m:t>
+        </m:r>
+        <m:r>
+          <w:rPr>
+            <w:rFonts w:ascii="Cambria Math" w:hAnsi="Cambria Math" w:cs="Times New Roman"/>
+            <w:sz w:val="24"/>
+            <w:szCs w:val="24"/>
+          </w:rPr>
+          <m:t xml:space="preserve"> </m:t>
         </m:r>
         <m:r>
           <m:rPr>
@@ -29479,7 +30416,7 @@
     </w:p>
     <w:p>
       <w:pPr>
-        <w:spacing w:after="0" w:line="240" w:lineRule="auto"/>
+        <w:spacing w:after="0" w:line="360" w:lineRule="auto"/>
         <w:rPr>
           <w:rFonts w:ascii="Times New Roman" w:eastAsiaTheme="minorEastAsia" w:hAnsi="Times New Roman" w:cs="Times New Roman"/>
           <w:sz w:val="24"/>
@@ -29545,7 +30482,18 @@
             <w:sz w:val="24"/>
             <w:szCs w:val="24"/>
           </w:rPr>
-          <m:t xml:space="preserve">5,797 м </m:t>
+          <m:t>3,726</m:t>
+        </m:r>
+        <m:r>
+          <m:rPr>
+            <m:sty m:val="p"/>
+          </m:rPr>
+          <w:rPr>
+            <w:rFonts w:ascii="Cambria Math" w:hAnsi="Cambria Math" w:cs="Times New Roman"/>
+            <w:sz w:val="24"/>
+            <w:szCs w:val="24"/>
+          </w:rPr>
+          <m:t xml:space="preserve"> м </m:t>
         </m:r>
       </m:oMath>
       <w:r>
@@ -29571,7 +30519,15 @@
             <w:sz w:val="24"/>
             <w:szCs w:val="24"/>
           </w:rPr>
-          <m:t>3,36 м</m:t>
+          <m:t>3,101</m:t>
+        </m:r>
+        <m:r>
+          <w:rPr>
+            <w:rFonts w:ascii="Cambria Math" w:hAnsi="Cambria Math" w:cs="Times New Roman"/>
+            <w:sz w:val="24"/>
+            <w:szCs w:val="24"/>
+          </w:rPr>
+          <m:t xml:space="preserve"> м</m:t>
         </m:r>
       </m:oMath>
       <w:r>
@@ -29622,6 +30578,97 @@
                 <w:szCs w:val="24"/>
               </w:rPr>
               <m:t>го</m:t>
+            </m:r>
+          </m:sub>
+        </m:sSub>
+        <m:r>
+          <w:rPr>
+            <w:rFonts w:ascii="Cambria Math" w:hAnsi="Cambria Math" w:cs="Times New Roman"/>
+            <w:sz w:val="24"/>
+            <w:szCs w:val="24"/>
+          </w:rPr>
+          <m:t>=</m:t>
+        </m:r>
+        <m:r>
+          <m:rPr>
+            <m:sty m:val="p"/>
+          </m:rPr>
+          <w:rPr>
+            <w:rFonts w:ascii="Cambria Math" w:hAnsi="Cambria Math"/>
+            <w:sz w:val="24"/>
+            <w:szCs w:val="24"/>
+          </w:rPr>
+          <m:t>2,91</m:t>
+        </m:r>
+        <m:r>
+          <m:rPr>
+            <m:sty m:val="p"/>
+          </m:rPr>
+          <w:rPr>
+            <w:rFonts w:ascii="Cambria Math" w:hAnsi="Cambria Math" w:cs="Arial"/>
+            <w:sz w:val="24"/>
+            <w:szCs w:val="24"/>
+          </w:rPr>
+          <m:t xml:space="preserve"> м</m:t>
+        </m:r>
+      </m:oMath>
+    </w:p>
+    <w:p>
+      <w:pPr>
+        <w:spacing w:after="0" w:line="360" w:lineRule="auto"/>
+        <w:rPr>
+          <w:rFonts w:ascii="Times New Roman" w:hAnsi="Times New Roman" w:cs="Times New Roman"/>
+          <w:sz w:val="24"/>
+          <w:szCs w:val="24"/>
+        </w:rPr>
+      </w:pPr>
+      <w:r>
+        <w:rPr>
+          <w:rFonts w:ascii="Times New Roman" w:eastAsiaTheme="minorEastAsia" w:hAnsi="Times New Roman" w:cs="Times New Roman"/>
+          <w:sz w:val="24"/>
+          <w:szCs w:val="24"/>
+        </w:rPr>
+        <w:t>Длина ПО</w:t>
+      </w:r>
+      <w:r>
+        <w:rPr>
+          <w:rFonts w:ascii="Times New Roman" w:hAnsi="Times New Roman" w:cs="Times New Roman"/>
+          <w:sz w:val="24"/>
+          <w:szCs w:val="24"/>
+        </w:rPr>
+        <w:t xml:space="preserve">: </w:t>
+      </w:r>
+      <m:oMath>
+        <m:sSub>
+          <m:sSubPr>
+            <m:ctrlPr>
+              <w:rPr>
+                <w:rFonts w:ascii="Cambria Math" w:hAnsi="Cambria Math" w:cs="Times New Roman"/>
+                <w:i/>
+                <w:sz w:val="24"/>
+                <w:szCs w:val="24"/>
+              </w:rPr>
+            </m:ctrlPr>
+          </m:sSubPr>
+          <m:e>
+            <m:r>
+              <w:rPr>
+                <w:rFonts w:ascii="Cambria Math" w:hAnsi="Cambria Math" w:cs="Times New Roman"/>
+                <w:sz w:val="24"/>
+                <w:szCs w:val="24"/>
+                <w:lang w:val="en-US"/>
+              </w:rPr>
+              <m:t>l</m:t>
+            </m:r>
+          </m:e>
+          <m:sub>
+            <m:r>
+              <w:rPr>
+                <w:rFonts w:ascii="Cambria Math" w:hAnsi="Cambria Math" w:cs="Times New Roman"/>
+                <w:sz w:val="24"/>
+                <w:szCs w:val="24"/>
+              </w:rPr>
+              <m:t>по</m:t>
             </m:r>
           </m:sub>
         </m:sSub>
@@ -29639,29 +30686,31 @@
           </m:rPr>
           <w:rPr>
             <w:rFonts w:ascii="Cambria Math" w:hAnsi="Cambria Math" w:cs="Arial"/>
-            <w:sz w:val="20"/>
-            <w:szCs w:val="20"/>
+            <w:sz w:val="24"/>
+            <w:szCs w:val="24"/>
           </w:rPr>
-          <m:t>2,374 м</m:t>
+          <m:t xml:space="preserve">0,786 </m:t>
+        </m:r>
+        <m:r>
+          <m:rPr>
+            <m:sty m:val="p"/>
+          </m:rPr>
+          <w:rPr>
+            <w:rFonts w:ascii="Cambria Math" w:hAnsi="Cambria Math" w:cs="Arial"/>
+            <w:sz w:val="24"/>
+            <w:szCs w:val="24"/>
+          </w:rPr>
+          <m:t>м</m:t>
         </m:r>
       </m:oMath>
-    </w:p>
-    <w:p>
-      <w:pPr>
-        <w:spacing w:after="0" w:line="240" w:lineRule="auto"/>
-        <w:rPr>
-          <w:rFonts w:ascii="Times New Roman" w:hAnsi="Times New Roman" w:cs="Times New Roman"/>
-          <w:sz w:val="24"/>
-          <w:szCs w:val="24"/>
-        </w:rPr>
-      </w:pPr>
       <w:r>
         <w:rPr>
           <w:rFonts w:ascii="Times New Roman" w:eastAsiaTheme="minorEastAsia" w:hAnsi="Times New Roman" w:cs="Times New Roman"/>
           <w:sz w:val="24"/>
           <w:szCs w:val="24"/>
         </w:rPr>
-        <w:t>Длина ПО</w:t>
+        <w:tab/>
+        <w:t>Длина ПХО</w:t>
       </w:r>
       <w:r>
         <w:rPr>
@@ -29701,7 +30750,7 @@
                 <w:sz w:val="24"/>
                 <w:szCs w:val="24"/>
               </w:rPr>
-              <m:t>по</m:t>
+              <m:t>пхо</m:t>
             </m:r>
           </m:sub>
         </m:sSub>
@@ -29719,81 +30768,10 @@
           </m:rPr>
           <w:rPr>
             <w:rFonts w:ascii="Cambria Math" w:hAnsi="Cambria Math" w:cs="Arial"/>
-            <w:sz w:val="20"/>
-            <w:szCs w:val="20"/>
-          </w:rPr>
-          <m:t>0,79 м</m:t>
-        </m:r>
-      </m:oMath>
-      <w:r>
-        <w:rPr>
-          <w:rFonts w:ascii="Times New Roman" w:eastAsiaTheme="minorEastAsia" w:hAnsi="Times New Roman" w:cs="Times New Roman"/>
-          <w:sz w:val="24"/>
-          <w:szCs w:val="24"/>
-        </w:rPr>
-        <w:tab/>
-        <w:t>Длина ПХО</w:t>
-      </w:r>
-      <w:r>
-        <w:rPr>
-          <w:rFonts w:ascii="Times New Roman" w:hAnsi="Times New Roman" w:cs="Times New Roman"/>
-          <w:sz w:val="24"/>
-          <w:szCs w:val="24"/>
-        </w:rPr>
-        <w:t xml:space="preserve">: </w:t>
-      </w:r>
-      <m:oMath>
-        <m:sSub>
-          <m:sSubPr>
-            <m:ctrlPr>
-              <w:rPr>
-                <w:rFonts w:ascii="Cambria Math" w:hAnsi="Cambria Math" w:cs="Times New Roman"/>
-                <w:i/>
-                <w:sz w:val="24"/>
-                <w:szCs w:val="24"/>
-              </w:rPr>
-            </m:ctrlPr>
-          </m:sSubPr>
-          <m:e>
-            <m:r>
-              <w:rPr>
-                <w:rFonts w:ascii="Cambria Math" w:hAnsi="Cambria Math" w:cs="Times New Roman"/>
-                <w:sz w:val="24"/>
-                <w:szCs w:val="24"/>
-                <w:lang w:val="en-US"/>
-              </w:rPr>
-              <m:t>l</m:t>
-            </m:r>
-          </m:e>
-          <m:sub>
-            <m:r>
-              <w:rPr>
-                <w:rFonts w:ascii="Cambria Math" w:hAnsi="Cambria Math" w:cs="Times New Roman"/>
-                <w:sz w:val="24"/>
-                <w:szCs w:val="24"/>
-              </w:rPr>
-              <m:t>пхо</m:t>
-            </m:r>
-          </m:sub>
-        </m:sSub>
-        <m:r>
-          <w:rPr>
-            <w:rFonts w:ascii="Cambria Math" w:hAnsi="Cambria Math" w:cs="Times New Roman"/>
             <w:sz w:val="24"/>
             <w:szCs w:val="24"/>
           </w:rPr>
-          <m:t>=</m:t>
-        </m:r>
-        <m:r>
-          <m:rPr>
-            <m:sty m:val="p"/>
-          </m:rPr>
-          <w:rPr>
-            <w:rFonts w:ascii="Cambria Math" w:hAnsi="Cambria Math" w:cs="Arial"/>
-            <w:sz w:val="20"/>
-            <w:szCs w:val="20"/>
-          </w:rPr>
-          <m:t xml:space="preserve">4,77 </m:t>
+          <m:t xml:space="preserve">4,48 </m:t>
         </m:r>
       </m:oMath>
       <w:r>
@@ -29807,7 +30785,7 @@
     </w:p>
     <w:p>
       <w:pPr>
-        <w:spacing w:after="0" w:line="240" w:lineRule="auto"/>
+        <w:spacing w:after="0" w:line="360" w:lineRule="auto"/>
         <w:rPr>
           <w:rFonts w:ascii="Times New Roman" w:hAnsi="Times New Roman" w:cs="Times New Roman"/>
           <w:sz w:val="24"/>
@@ -29865,6 +30843,14 @@
           </w:rPr>
           <m:t xml:space="preserve"> =</m:t>
         </m:r>
+        <m:r>
+          <w:rPr>
+            <w:rFonts w:ascii="Cambria Math" w:hAnsi="Cambria Math" w:cs="Times New Roman"/>
+            <w:sz w:val="24"/>
+            <w:szCs w:val="24"/>
+          </w:rPr>
+          <m:t xml:space="preserve"> </m:t>
+        </m:r>
       </m:oMath>
       <w:r>
         <w:rPr>
@@ -29872,15 +30858,63 @@
           <w:sz w:val="24"/>
           <w:szCs w:val="24"/>
         </w:rPr>
-        <w:t xml:space="preserve">2,406 +6,79+ 4,405 + </w:t>
-      </w:r>
-      <w:r>
-        <w:rPr>
-          <w:rFonts w:ascii="Times New Roman" w:hAnsi="Times New Roman" w:cs="Times New Roman"/>
-          <w:sz w:val="24"/>
-          <w:szCs w:val="24"/>
-        </w:rPr>
-        <w:t>5,797</w:t>
+        <w:t>2,4</w:t>
+      </w:r>
+      <w:r>
+        <w:rPr>
+          <w:rFonts w:ascii="Times New Roman" w:hAnsi="Times New Roman" w:cs="Times New Roman"/>
+          <w:sz w:val="24"/>
+          <w:szCs w:val="24"/>
+        </w:rPr>
+        <w:t>84</w:t>
+      </w:r>
+      <w:r>
+        <w:rPr>
+          <w:rFonts w:ascii="Times New Roman" w:hAnsi="Times New Roman" w:cs="Times New Roman"/>
+          <w:sz w:val="24"/>
+          <w:szCs w:val="24"/>
+        </w:rPr>
+        <w:t xml:space="preserve"> +</w:t>
+      </w:r>
+      <w:r>
+        <w:rPr>
+          <w:rFonts w:ascii="Times New Roman" w:hAnsi="Times New Roman" w:cs="Times New Roman"/>
+          <w:sz w:val="24"/>
+          <w:szCs w:val="24"/>
+        </w:rPr>
+        <w:t xml:space="preserve"> 5</w:t>
+      </w:r>
+      <w:r>
+        <w:rPr>
+          <w:rFonts w:ascii="Times New Roman" w:hAnsi="Times New Roman" w:cs="Times New Roman"/>
+          <w:sz w:val="24"/>
+          <w:szCs w:val="24"/>
+        </w:rPr>
+        <w:t>,</w:t>
+      </w:r>
+      <w:r>
+        <w:rPr>
+          <w:rFonts w:ascii="Times New Roman" w:hAnsi="Times New Roman" w:cs="Times New Roman"/>
+          <w:sz w:val="24"/>
+          <w:szCs w:val="24"/>
+        </w:rPr>
+        <w:t>039</w:t>
+      </w:r>
+      <w:r>
+        <w:rPr>
+          <w:rFonts w:ascii="Times New Roman" w:hAnsi="Times New Roman" w:cs="Times New Roman"/>
+          <w:sz w:val="24"/>
+          <w:szCs w:val="24"/>
+        </w:rPr>
+        <w:t>+ 4,4</w:t>
+      </w:r>
+      <w:r>
+        <w:rPr>
+          <w:rFonts w:ascii="Times New Roman" w:hAnsi="Times New Roman" w:cs="Times New Roman"/>
+          <w:sz w:val="24"/>
+          <w:szCs w:val="24"/>
+        </w:rPr>
+        <w:t>217</w:t>
       </w:r>
       <w:r>
         <w:rPr>
@@ -29896,15 +30930,103 @@
           <w:sz w:val="24"/>
           <w:szCs w:val="24"/>
         </w:rPr>
-        <w:t>3,36</w:t>
-      </w:r>
-      <w:r>
-        <w:rPr>
-          <w:rFonts w:ascii="Times New Roman" w:hAnsi="Times New Roman" w:cs="Times New Roman"/>
-          <w:sz w:val="24"/>
-          <w:szCs w:val="24"/>
-        </w:rPr>
-        <w:t xml:space="preserve"> + 2,38 + 0,79 + 4,77</w:t>
+        <w:t>3</w:t>
+      </w:r>
+      <w:r>
+        <w:rPr>
+          <w:rFonts w:ascii="Times New Roman" w:hAnsi="Times New Roman" w:cs="Times New Roman"/>
+          <w:sz w:val="24"/>
+          <w:szCs w:val="24"/>
+        </w:rPr>
+        <w:t>,7</w:t>
+      </w:r>
+      <w:r>
+        <w:rPr>
+          <w:rFonts w:ascii="Times New Roman" w:hAnsi="Times New Roman" w:cs="Times New Roman"/>
+          <w:sz w:val="24"/>
+          <w:szCs w:val="24"/>
+        </w:rPr>
+        <w:t>26</w:t>
+      </w:r>
+      <w:r>
+        <w:rPr>
+          <w:rFonts w:ascii="Times New Roman" w:hAnsi="Times New Roman" w:cs="Times New Roman"/>
+          <w:sz w:val="24"/>
+          <w:szCs w:val="24"/>
+        </w:rPr>
+        <w:t xml:space="preserve"> + </w:t>
+      </w:r>
+      <w:r>
+        <w:rPr>
+          <w:rFonts w:ascii="Times New Roman" w:hAnsi="Times New Roman" w:cs="Times New Roman"/>
+          <w:sz w:val="24"/>
+          <w:szCs w:val="24"/>
+        </w:rPr>
+        <w:t>3</w:t>
+      </w:r>
+      <w:r>
+        <w:rPr>
+          <w:rFonts w:ascii="Times New Roman" w:hAnsi="Times New Roman" w:cs="Times New Roman"/>
+          <w:sz w:val="24"/>
+          <w:szCs w:val="24"/>
+        </w:rPr>
+        <w:t>,</w:t>
+      </w:r>
+      <w:r>
+        <w:rPr>
+          <w:rFonts w:ascii="Times New Roman" w:hAnsi="Times New Roman" w:cs="Times New Roman"/>
+          <w:sz w:val="24"/>
+          <w:szCs w:val="24"/>
+        </w:rPr>
+        <w:t>101</w:t>
+      </w:r>
+      <w:r>
+        <w:rPr>
+          <w:rFonts w:ascii="Times New Roman" w:hAnsi="Times New Roman" w:cs="Times New Roman"/>
+          <w:sz w:val="24"/>
+          <w:szCs w:val="24"/>
+        </w:rPr>
+        <w:t xml:space="preserve"> + 2,</w:t>
+      </w:r>
+      <w:r>
+        <w:rPr>
+          <w:rFonts w:ascii="Times New Roman" w:hAnsi="Times New Roman" w:cs="Times New Roman"/>
+          <w:sz w:val="24"/>
+          <w:szCs w:val="24"/>
+        </w:rPr>
+        <w:t>91</w:t>
+      </w:r>
+      <w:r>
+        <w:rPr>
+          <w:rFonts w:ascii="Times New Roman" w:hAnsi="Times New Roman" w:cs="Times New Roman"/>
+          <w:sz w:val="24"/>
+          <w:szCs w:val="24"/>
+        </w:rPr>
+        <w:t xml:space="preserve"> + 0,7</w:t>
+      </w:r>
+      <w:r>
+        <w:rPr>
+          <w:rFonts w:ascii="Times New Roman" w:hAnsi="Times New Roman" w:cs="Times New Roman"/>
+          <w:sz w:val="24"/>
+          <w:szCs w:val="24"/>
+        </w:rPr>
+        <w:t>86</w:t>
+      </w:r>
+      <w:r>
+        <w:rPr>
+          <w:rFonts w:ascii="Times New Roman" w:hAnsi="Times New Roman" w:cs="Times New Roman"/>
+          <w:sz w:val="24"/>
+          <w:szCs w:val="24"/>
+        </w:rPr>
+        <w:t xml:space="preserve"> + 4,</w:t>
+      </w:r>
+      <w:r>
+        <w:rPr>
+          <w:rFonts w:ascii="Times New Roman" w:hAnsi="Times New Roman" w:cs="Times New Roman"/>
+          <w:sz w:val="24"/>
+          <w:szCs w:val="24"/>
+        </w:rPr>
+        <w:t xml:space="preserve">48 </w:t>
       </w:r>
       <w:r>
         <w:rPr>
@@ -29928,15 +31050,23 @@
           <w:sz w:val="24"/>
           <w:szCs w:val="24"/>
         </w:rPr>
-        <w:t>30,668</w:t>
-      </w:r>
-      <w:r>
-        <w:rPr>
-          <w:rFonts w:ascii="Times New Roman" w:hAnsi="Times New Roman" w:cs="Times New Roman"/>
-          <w:sz w:val="24"/>
-          <w:szCs w:val="24"/>
-        </w:rPr>
-        <w:t xml:space="preserve"> м</w:t>
+        <w:t>26,9477</w:t>
+      </w:r>
+      <w:r>
+        <w:rPr>
+          <w:rFonts w:ascii="Times New Roman" w:hAnsi="Times New Roman" w:cs="Times New Roman"/>
+          <w:sz w:val="24"/>
+          <w:szCs w:val="24"/>
+        </w:rPr>
+        <w:t xml:space="preserve"> </w:t>
+      </w:r>
+      <w:r>
+        <w:rPr>
+          <w:rFonts w:ascii="Times New Roman" w:hAnsi="Times New Roman" w:cs="Times New Roman"/>
+          <w:sz w:val="24"/>
+          <w:szCs w:val="24"/>
+        </w:rPr>
+        <w:t>м</w:t>
       </w:r>
     </w:p>
     <w:p>
@@ -37672,7 +38802,6 @@
   <w:style w:type="character" w:default="1" w:styleId="a0">
     <w:name w:val="Default Paragraph Font"/>
     <w:uiPriority w:val="1"/>
-    <w:semiHidden/>
     <w:unhideWhenUsed/>
   </w:style>
   <w:style w:type="table" w:default="1" w:styleId="a1">
@@ -38569,10 +39698,6 @@
 </file>
 
 <file path=customXml/item1.xml><?xml version="1.0" encoding="utf-8"?>
-<b:Sources xmlns:b="http://schemas.openxmlformats.org/officeDocument/2006/bibliography" xmlns="http://schemas.openxmlformats.org/officeDocument/2006/bibliography" SelectedStyle="\APASixthEditionOfficeOnline.xsl" StyleName="APA" Version="6"/>
-</file>
-
-<file path=customXml/item2.xml><?xml version="1.0" encoding="utf-8"?>
 <s:customData xmlns="http://www.wps.cn/officeDocument/2013/wpsCustomData" xmlns:s="http://www.wps.cn/officeDocument/2013/wpsCustomData">
   <customSectProps>
     <customSectPr/>
@@ -38580,18 +39705,22 @@
 </s:customData>
 </file>
 
+<file path=customXml/item2.xml><?xml version="1.0" encoding="utf-8"?>
+<b:Sources xmlns:b="http://schemas.openxmlformats.org/officeDocument/2006/bibliography" xmlns="http://schemas.openxmlformats.org/officeDocument/2006/bibliography" SelectedStyle="\APASixthEditionOfficeOnline.xsl" StyleName="APA" Version="6"/>
+</file>
+
 <file path=customXml/itemProps1.xml><?xml version="1.0" encoding="utf-8"?>
+<ds:datastoreItem xmlns:ds="http://schemas.openxmlformats.org/officeDocument/2006/customXml" ds:itemID="{B1977F7D-205B-4081-913C-38D41E755F92}">
+  <ds:schemaRefs>
+    <ds:schemaRef ds:uri="http://www.wps.cn/officeDocument/2013/wpsCustomData"/>
+  </ds:schemaRefs>
+</ds:datastoreItem>
+</file>
+
+<file path=customXml/itemProps2.xml><?xml version="1.0" encoding="utf-8"?>
 <ds:datastoreItem xmlns:ds="http://schemas.openxmlformats.org/officeDocument/2006/customXml" ds:itemID="{53DF9A09-C86B-46A5-946C-3DE4041B31E8}">
   <ds:schemaRefs>
     <ds:schemaRef ds:uri="http://schemas.openxmlformats.org/officeDocument/2006/bibliography"/>
   </ds:schemaRefs>
 </ds:datastoreItem>
-</file>
-
-<file path=customXml/itemProps2.xml><?xml version="1.0" encoding="utf-8"?>
-<ds:datastoreItem xmlns:ds="http://schemas.openxmlformats.org/officeDocument/2006/customXml" ds:itemID="{B1977F7D-205B-4081-913C-38D41E755F92}">
-  <ds:schemaRefs>
-    <ds:schemaRef ds:uri="http://www.wps.cn/officeDocument/2013/wpsCustomData"/>
-  </ds:schemaRefs>
-</ds:datastoreItem>
 </file>
</xml_diff>